<commit_message>
Piano per Emiliano: aggiunta pagina 2 'Dove sono oggi - numeri veri'
Matrice motore x TF (PF tick reali), squadra forward 8 EA, studio gestione BE/trailing/parziale (16 strutture) su apertura DAX/Nasdaq. Applica il principio motore-poi-gestione coi numeri reali.

Co-Authored-By: Claude Opus 4.8 <noreply@anthropic.com>
Claude-Session: https://claude.ai/code/session_01CDYK6wPvja1Sh6AQwJLSEd
</commit_message>
<xml_diff>
--- a/piano_trading/PIANO_PER_EMILIANO.docx
+++ b/piano_trading/PIANO_PER_EMILIANO.docx
@@ -1857,6 +1857,1069 @@
           <w:szCs w:val="22"/>
         </w:rPr>
         <w:t xml:space="preserve">.</w:t>
+      </w:r>
+    </w:p>
+    <w:p>
+      <w:r>
+        <w:br w:type="page"/>
+      </w:r>
+    </w:p>
+    <w:p>
+      <w:pPr>
+        <w:spacing w:after="40"/>
+      </w:pPr>
+      <w:r>
+        <w:rPr>
+          <w:rFonts w:ascii="Georgia" w:cs="Georgia" w:eastAsia="Georgia" w:hAnsi="Georgia"/>
+          <w:b/>
+          <w:bCs/>
+          <w:color w:val="1F3A5F"/>
+          <w:sz w:val="40"/>
+          <w:szCs w:val="40"/>
+        </w:rPr>
+        <w:t xml:space="preserve">Dove sono oggi — i numeri veri</w:t>
+      </w:r>
+    </w:p>
+    <w:p>
+      <w:pPr>
+        <w:pBdr>
+          <w:bottom w:val="single" w:color="B8860B" w:sz="12" w:space="6"/>
+        </w:pBdr>
+        <w:spacing w:after="160"/>
+      </w:pPr>
+      <w:r>
+        <w:rPr>
+          <w:i/>
+          <w:iCs/>
+          <w:color w:val="555555"/>
+          <w:sz w:val="22"/>
+          <w:szCs w:val="22"/>
+        </w:rPr>
+        <w:t xml:space="preserve">Il metodo applicato: prima il MOTORE (validato a tick reali), poi la GESTIONE sopra.</w:t>
+      </w:r>
+    </w:p>
+    <w:p>
+      <w:pPr>
+        <w:pBdr>
+          <w:left w:val="single" w:color="2E5A8C" w:sz="24" w:space="12"/>
+        </w:pBdr>
+        <w:spacing w:after="140" w:before="320"/>
+      </w:pPr>
+      <w:r>
+        <w:rPr>
+          <w:rFonts w:ascii="Georgia" w:cs="Georgia" w:eastAsia="Georgia" w:hAnsi="Georgia"/>
+          <w:b/>
+          <w:bCs/>
+          <w:color w:val="2E5A8C"/>
+          <w:sz w:val="28"/>
+          <w:szCs w:val="28"/>
+        </w:rPr>
+        <w:t xml:space="preserve">1 · Il motore giusto per ogni strategia (matrice motore × timeframe)</w:t>
+      </w:r>
+    </w:p>
+    <w:p>
+      <w:pPr>
+        <w:spacing w:after="120"/>
+      </w:pPr>
+      <w:r>
+        <w:rPr>
+          <w:rFonts w:ascii="Calibri" w:cs="Calibri" w:eastAsia="Calibri" w:hAnsi="Calibri"/>
+          <w:b w:val="false"/>
+          <w:bCs w:val="false"/>
+          <w:i w:val="false"/>
+          <w:iCs w:val="false"/>
+          <w:color w:val="222222"/>
+          <w:sz w:val="22"/>
+          <w:szCs w:val="22"/>
+        </w:rPr>
+        <w:t xml:space="preserve">Ogni motore ha il </w:t>
+      </w:r>
+      <w:r>
+        <w:rPr>
+          <w:rFonts w:ascii="Calibri" w:cs="Calibri" w:eastAsia="Calibri" w:hAnsi="Calibri"/>
+          <w:b/>
+          <w:bCs/>
+          <w:i w:val="false"/>
+          <w:iCs w:val="false"/>
+          <w:color w:val="1F3A5F"/>
+          <w:sz w:val="22"/>
+          <w:szCs w:val="22"/>
+        </w:rPr>
+        <w:t xml:space="preserve">suo</w:t>
+      </w:r>
+      <w:r>
+        <w:rPr>
+          <w:rFonts w:ascii="Calibri" w:cs="Calibri" w:eastAsia="Calibri" w:hAnsi="Calibri"/>
+          <w:b w:val="false"/>
+          <w:bCs w:val="false"/>
+          <w:i w:val="false"/>
+          <w:iCs w:val="false"/>
+          <w:color w:val="222222"/>
+          <w:sz w:val="22"/>
+          <w:szCs w:val="22"/>
+        </w:rPr>
+        <w:t xml:space="preserve"> timeframe: cambiarlo trasforma uno scarto in un candidato. I numeri sono </w:t>
+      </w:r>
+      <w:r>
+        <w:rPr>
+          <w:rFonts w:ascii="Calibri" w:cs="Calibri" w:eastAsia="Calibri" w:hAnsi="Calibri"/>
+          <w:b/>
+          <w:bCs/>
+          <w:i w:val="false"/>
+          <w:iCs w:val="false"/>
+          <w:color w:val="B8860B"/>
+          <w:sz w:val="22"/>
+          <w:szCs w:val="22"/>
+        </w:rPr>
+        <w:t xml:space="preserve">Profit Factor a TICK REALI</w:t>
+      </w:r>
+      <w:r>
+        <w:rPr>
+          <w:rFonts w:ascii="Calibri" w:cs="Calibri" w:eastAsia="Calibri" w:hAnsi="Calibri"/>
+          <w:b w:val="false"/>
+          <w:bCs w:val="false"/>
+          <w:i w:val="false"/>
+          <w:iCs w:val="false"/>
+          <w:color w:val="222222"/>
+          <w:sz w:val="22"/>
+          <w:szCs w:val="22"/>
+        </w:rPr>
+        <w:t xml:space="preserve"> (dove disponibili).</w:t>
+      </w:r>
+    </w:p>
+    <w:tbl>
+      <w:tblPr>
+        <w:tblW w:type="dxa" w:w="9360"/>
+        <w:tblBorders>
+          <w:top w:val="single" w:color="CCCCCC" w:sz="4"/>
+          <w:left w:val="single" w:color="CCCCCC" w:sz="4"/>
+          <w:bottom w:val="single" w:color="CCCCCC" w:sz="4"/>
+          <w:right w:val="single" w:color="CCCCCC" w:sz="4"/>
+          <w:insideH w:val="single" w:color="CCCCCC" w:sz="4"/>
+          <w:insideV w:val="single" w:color="CCCCCC" w:sz="4"/>
+        </w:tblBorders>
+      </w:tblPr>
+      <w:tblGrid>
+        <w:gridCol w:w="2200"/>
+        <w:gridCol w:w="1900"/>
+        <w:gridCol w:w="4100"/>
+        <w:gridCol w:w="1160"/>
+      </w:tblGrid>
+      <w:tr>
+        <w:trPr>
+          <w:tblHeader/>
+        </w:trPr>
+        <w:tc>
+          <w:tcPr>
+            <w:tcW w:type="dxa" w:w="2200"/>
+            <w:shd w:fill="1F3A5F" w:color="auto" w:val="clear"/>
+            <w:tcMar>
+              <w:top w:type="dxa" w:w="70"/>
+              <w:left w:type="dxa" w:w="110"/>
+              <w:bottom w:type="dxa" w:w="70"/>
+              <w:right w:type="dxa" w:w="110"/>
+            </w:tcMar>
+          </w:tcPr>
+          <w:p>
+            <w:r>
+              <w:rPr>
+                <w:rFonts w:ascii="Calibri" w:cs="Calibri" w:eastAsia="Calibri" w:hAnsi="Calibri"/>
+                <w:b/>
+                <w:bCs/>
+                <w:color w:val="FFFFFF"/>
+                <w:sz w:val="20"/>
+                <w:szCs w:val="20"/>
+              </w:rPr>
+              <w:t xml:space="preserve">Motore</w:t>
+            </w:r>
+          </w:p>
+        </w:tc>
+        <w:tc>
+          <w:tcPr>
+            <w:tcW w:type="dxa" w:w="1900"/>
+            <w:shd w:fill="1F3A5F" w:color="auto" w:val="clear"/>
+            <w:tcMar>
+              <w:top w:type="dxa" w:w="70"/>
+              <w:left w:type="dxa" w:w="110"/>
+              <w:bottom w:type="dxa" w:w="70"/>
+              <w:right w:type="dxa" w:w="110"/>
+            </w:tcMar>
+          </w:tcPr>
+          <w:p>
+            <w:r>
+              <w:rPr>
+                <w:rFonts w:ascii="Calibri" w:cs="Calibri" w:eastAsia="Calibri" w:hAnsi="Calibri"/>
+                <w:b/>
+                <w:bCs/>
+                <w:color w:val="FFFFFF"/>
+                <w:sz w:val="20"/>
+                <w:szCs w:val="20"/>
+              </w:rPr>
+              <w:t xml:space="preserve">TF migliore</w:t>
+            </w:r>
+          </w:p>
+        </w:tc>
+        <w:tc>
+          <w:tcPr>
+            <w:tcW w:type="dxa" w:w="4100"/>
+            <w:shd w:fill="1F3A5F" w:color="auto" w:val="clear"/>
+            <w:tcMar>
+              <w:top w:type="dxa" w:w="70"/>
+              <w:left w:type="dxa" w:w="110"/>
+              <w:bottom w:type="dxa" w:w="70"/>
+              <w:right w:type="dxa" w:w="110"/>
+            </w:tcMar>
+          </w:tcPr>
+          <w:p>
+            <w:r>
+              <w:rPr>
+                <w:rFonts w:ascii="Calibri" w:cs="Calibri" w:eastAsia="Calibri" w:hAnsi="Calibri"/>
+                <w:b/>
+                <w:bCs/>
+                <w:color w:val="FFFFFF"/>
+                <w:sz w:val="20"/>
+                <w:szCs w:val="20"/>
+              </w:rPr>
+              <w:t xml:space="preserve">Migliori simboli (PF tick reali)</w:t>
+            </w:r>
+          </w:p>
+        </w:tc>
+        <w:tc>
+          <w:tcPr>
+            <w:tcW w:type="dxa" w:w="1160"/>
+            <w:shd w:fill="1F3A5F" w:color="auto" w:val="clear"/>
+            <w:tcMar>
+              <w:top w:type="dxa" w:w="70"/>
+              <w:left w:type="dxa" w:w="110"/>
+              <w:bottom w:type="dxa" w:w="70"/>
+              <w:right w:type="dxa" w:w="110"/>
+            </w:tcMar>
+          </w:tcPr>
+          <w:p>
+            <w:r>
+              <w:rPr>
+                <w:rFonts w:ascii="Calibri" w:cs="Calibri" w:eastAsia="Calibri" w:hAnsi="Calibri"/>
+                <w:b/>
+                <w:bCs/>
+                <w:color w:val="FFFFFF"/>
+                <w:sz w:val="20"/>
+                <w:szCs w:val="20"/>
+              </w:rPr>
+              <w:t xml:space="preserve">Stato</w:t>
+            </w:r>
+          </w:p>
+        </w:tc>
+      </w:tr>
+      <w:tr>
+        <w:tc>
+          <w:tcPr>
+            <w:tcW w:type="dxa" w:w="2200"/>
+            <w:shd w:fill="FFFFFF" w:color="auto" w:val="clear"/>
+            <w:tcMar>
+              <w:top w:type="dxa" w:w="70"/>
+              <w:left w:type="dxa" w:w="110"/>
+              <w:bottom w:type="dxa" w:w="70"/>
+              <w:right w:type="dxa" w:w="110"/>
+            </w:tcMar>
+            <w:vAlign w:val="center"/>
+          </w:tcPr>
+          <w:p>
+            <w:r>
+              <w:rPr>
+                <w:rFonts w:ascii="Calibri" w:cs="Calibri" w:eastAsia="Calibri" w:hAnsi="Calibri"/>
+                <w:b/>
+                <w:bCs/>
+                <w:color w:val="2E5A8C"/>
+                <w:sz w:val="20"/>
+                <w:szCs w:val="20"/>
+              </w:rPr>
+              <w:t xml:space="preserve">SupertrendReversal</w:t>
+            </w:r>
+          </w:p>
+        </w:tc>
+        <w:tc>
+          <w:tcPr>
+            <w:tcW w:type="dxa" w:w="1900"/>
+            <w:shd w:fill="FFFFFF" w:color="auto" w:val="clear"/>
+            <w:tcMar>
+              <w:top w:type="dxa" w:w="70"/>
+              <w:left w:type="dxa" w:w="110"/>
+              <w:bottom w:type="dxa" w:w="70"/>
+              <w:right w:type="dxa" w:w="110"/>
+            </w:tcMar>
+            <w:vAlign w:val="center"/>
+          </w:tcPr>
+          <w:p>
+            <w:r>
+              <w:rPr>
+                <w:rFonts w:ascii="Calibri" w:cs="Calibri" w:eastAsia="Calibri" w:hAnsi="Calibri"/>
+                <w:b w:val="false"/>
+                <w:bCs w:val="false"/>
+                <w:color w:val="222222"/>
+                <w:sz w:val="20"/>
+                <w:szCs w:val="20"/>
+              </w:rPr>
+              <w:t xml:space="preserve">H4 (Nasdaq → H1)</w:t>
+            </w:r>
+          </w:p>
+        </w:tc>
+        <w:tc>
+          <w:tcPr>
+            <w:tcW w:type="dxa" w:w="4100"/>
+            <w:shd w:fill="FFFFFF" w:color="auto" w:val="clear"/>
+            <w:tcMar>
+              <w:top w:type="dxa" w:w="70"/>
+              <w:left w:type="dxa" w:w="110"/>
+              <w:bottom w:type="dxa" w:w="70"/>
+              <w:right w:type="dxa" w:w="110"/>
+            </w:tcMar>
+            <w:vAlign w:val="center"/>
+          </w:tcPr>
+          <w:p>
+            <w:r>
+              <w:rPr>
+                <w:rFonts w:ascii="Calibri" w:cs="Calibri" w:eastAsia="Calibri" w:hAnsi="Calibri"/>
+                <w:b w:val="false"/>
+                <w:bCs w:val="false"/>
+                <w:color w:val="222222"/>
+                <w:sz w:val="20"/>
+                <w:szCs w:val="20"/>
+              </w:rPr>
+              <w:t xml:space="preserve">Oro 1,46 · Nasdaq H1 1,40 · Argento 1,37 (DD ~1–2%)</w:t>
+            </w:r>
+          </w:p>
+        </w:tc>
+        <w:tc>
+          <w:tcPr>
+            <w:tcW w:type="dxa" w:w="1160"/>
+            <w:shd w:fill="FFFFFF" w:color="auto" w:val="clear"/>
+            <w:tcMar>
+              <w:top w:type="dxa" w:w="70"/>
+              <w:left w:type="dxa" w:w="110"/>
+              <w:bottom w:type="dxa" w:w="70"/>
+              <w:right w:type="dxa" w:w="110"/>
+            </w:tcMar>
+            <w:vAlign w:val="center"/>
+          </w:tcPr>
+          <w:p>
+            <w:r>
+              <w:rPr>
+                <w:rFonts w:ascii="Calibri" w:cs="Calibri" w:eastAsia="Calibri" w:hAnsi="Calibri"/>
+                <w:b w:val="false"/>
+                <w:bCs w:val="false"/>
+                <w:color w:val="222222"/>
+                <w:sz w:val="20"/>
+                <w:szCs w:val="20"/>
+              </w:rPr>
+              <w:t xml:space="preserve">5 in forward</w:t>
+            </w:r>
+          </w:p>
+        </w:tc>
+      </w:tr>
+      <w:tr>
+        <w:tc>
+          <w:tcPr>
+            <w:tcW w:type="dxa" w:w="2200"/>
+            <w:shd w:fill="F4F7FB" w:color="auto" w:val="clear"/>
+            <w:tcMar>
+              <w:top w:type="dxa" w:w="70"/>
+              <w:left w:type="dxa" w:w="110"/>
+              <w:bottom w:type="dxa" w:w="70"/>
+              <w:right w:type="dxa" w:w="110"/>
+            </w:tcMar>
+            <w:vAlign w:val="center"/>
+          </w:tcPr>
+          <w:p>
+            <w:r>
+              <w:rPr>
+                <w:rFonts w:ascii="Calibri" w:cs="Calibri" w:eastAsia="Calibri" w:hAnsi="Calibri"/>
+                <w:b/>
+                <w:bCs/>
+                <w:color w:val="2E5A8C"/>
+                <w:sz w:val="20"/>
+                <w:szCs w:val="20"/>
+              </w:rPr>
+              <w:t xml:space="preserve">GoldenCross</w:t>
+            </w:r>
+          </w:p>
+        </w:tc>
+        <w:tc>
+          <w:tcPr>
+            <w:tcW w:type="dxa" w:w="1900"/>
+            <w:shd w:fill="F4F7FB" w:color="auto" w:val="clear"/>
+            <w:tcMar>
+              <w:top w:type="dxa" w:w="70"/>
+              <w:left w:type="dxa" w:w="110"/>
+              <w:bottom w:type="dxa" w:w="70"/>
+              <w:right w:type="dxa" w:w="110"/>
+            </w:tcMar>
+            <w:vAlign w:val="center"/>
+          </w:tcPr>
+          <w:p>
+            <w:r>
+              <w:rPr>
+                <w:rFonts w:ascii="Calibri" w:cs="Calibri" w:eastAsia="Calibri" w:hAnsi="Calibri"/>
+                <w:b w:val="false"/>
+                <w:bCs w:val="false"/>
+                <w:color w:val="222222"/>
+                <w:sz w:val="20"/>
+                <w:szCs w:val="20"/>
+              </w:rPr>
+              <w:t xml:space="preserve">H1 (USDCHF → H4)</w:t>
+            </w:r>
+          </w:p>
+        </w:tc>
+        <w:tc>
+          <w:tcPr>
+            <w:tcW w:type="dxa" w:w="4100"/>
+            <w:shd w:fill="F4F7FB" w:color="auto" w:val="clear"/>
+            <w:tcMar>
+              <w:top w:type="dxa" w:w="70"/>
+              <w:left w:type="dxa" w:w="110"/>
+              <w:bottom w:type="dxa" w:w="70"/>
+              <w:right w:type="dxa" w:w="110"/>
+            </w:tcMar>
+            <w:vAlign w:val="center"/>
+          </w:tcPr>
+          <w:p>
+            <w:r>
+              <w:rPr>
+                <w:rFonts w:ascii="Calibri" w:cs="Calibri" w:eastAsia="Calibri" w:hAnsi="Calibri"/>
+                <w:b w:val="false"/>
+                <w:bCs w:val="false"/>
+                <w:color w:val="222222"/>
+                <w:sz w:val="20"/>
+                <w:szCs w:val="20"/>
+              </w:rPr>
+              <w:t xml:space="preserve">USDCHF 2,63 · Argento 2,58 · EUR/AUD 3,34</w:t>
+            </w:r>
+          </w:p>
+        </w:tc>
+        <w:tc>
+          <w:tcPr>
+            <w:tcW w:type="dxa" w:w="1160"/>
+            <w:shd w:fill="F4F7FB" w:color="auto" w:val="clear"/>
+            <w:tcMar>
+              <w:top w:type="dxa" w:w="70"/>
+              <w:left w:type="dxa" w:w="110"/>
+              <w:bottom w:type="dxa" w:w="70"/>
+              <w:right w:type="dxa" w:w="110"/>
+            </w:tcMar>
+            <w:vAlign w:val="center"/>
+          </w:tcPr>
+          <w:p>
+            <w:r>
+              <w:rPr>
+                <w:rFonts w:ascii="Calibri" w:cs="Calibri" w:eastAsia="Calibri" w:hAnsi="Calibri"/>
+                <w:b w:val="false"/>
+                <w:bCs w:val="false"/>
+                <w:color w:val="222222"/>
+                <w:sz w:val="20"/>
+                <w:szCs w:val="20"/>
+              </w:rPr>
+              <w:t xml:space="preserve">3 in forward</w:t>
+            </w:r>
+          </w:p>
+        </w:tc>
+      </w:tr>
+      <w:tr>
+        <w:tc>
+          <w:tcPr>
+            <w:tcW w:type="dxa" w:w="2200"/>
+            <w:shd w:fill="FFFFFF" w:color="auto" w:val="clear"/>
+            <w:tcMar>
+              <w:top w:type="dxa" w:w="70"/>
+              <w:left w:type="dxa" w:w="110"/>
+              <w:bottom w:type="dxa" w:w="70"/>
+              <w:right w:type="dxa" w:w="110"/>
+            </w:tcMar>
+            <w:vAlign w:val="center"/>
+          </w:tcPr>
+          <w:p>
+            <w:r>
+              <w:rPr>
+                <w:rFonts w:ascii="Calibri" w:cs="Calibri" w:eastAsia="Calibri" w:hAnsi="Calibri"/>
+                <w:b/>
+                <w:bCs/>
+                <w:color w:val="2E5A8C"/>
+                <w:sz w:val="20"/>
+                <w:szCs w:val="20"/>
+              </w:rPr>
+              <w:t xml:space="preserve">EMA200</w:t>
+            </w:r>
+          </w:p>
+        </w:tc>
+        <w:tc>
+          <w:tcPr>
+            <w:tcW w:type="dxa" w:w="1900"/>
+            <w:shd w:fill="FFFFFF" w:color="auto" w:val="clear"/>
+            <w:tcMar>
+              <w:top w:type="dxa" w:w="70"/>
+              <w:left w:type="dxa" w:w="110"/>
+              <w:bottom w:type="dxa" w:w="70"/>
+              <w:right w:type="dxa" w:w="110"/>
+            </w:tcMar>
+            <w:vAlign w:val="center"/>
+          </w:tcPr>
+          <w:p>
+            <w:r>
+              <w:rPr>
+                <w:rFonts w:ascii="Calibri" w:cs="Calibri" w:eastAsia="Calibri" w:hAnsi="Calibri"/>
+                <w:b w:val="false"/>
+                <w:bCs w:val="false"/>
+                <w:color w:val="222222"/>
+                <w:sz w:val="20"/>
+                <w:szCs w:val="20"/>
+              </w:rPr>
+              <w:t xml:space="preserve">H4</w:t>
+            </w:r>
+          </w:p>
+        </w:tc>
+        <w:tc>
+          <w:tcPr>
+            <w:tcW w:type="dxa" w:w="4100"/>
+            <w:shd w:fill="FFFFFF" w:color="auto" w:val="clear"/>
+            <w:tcMar>
+              <w:top w:type="dxa" w:w="70"/>
+              <w:left w:type="dxa" w:w="110"/>
+              <w:bottom w:type="dxa" w:w="70"/>
+              <w:right w:type="dxa" w:w="110"/>
+            </w:tcMar>
+            <w:vAlign w:val="center"/>
+          </w:tcPr>
+          <w:p>
+            <w:r>
+              <w:rPr>
+                <w:rFonts w:ascii="Calibri" w:cs="Calibri" w:eastAsia="Calibri" w:hAnsi="Calibri"/>
+                <w:b w:val="false"/>
+                <w:bCs w:val="false"/>
+                <w:color w:val="222222"/>
+                <w:sz w:val="20"/>
+                <w:szCs w:val="20"/>
+              </w:rPr>
+              <w:t xml:space="preserve">200AUD 2,78 · AUD/JPY 2,68 · Oro 2,22 (OHLC)</w:t>
+            </w:r>
+          </w:p>
+        </w:tc>
+        <w:tc>
+          <w:tcPr>
+            <w:tcW w:type="dxa" w:w="1160"/>
+            <w:shd w:fill="FFFFFF" w:color="auto" w:val="clear"/>
+            <w:tcMar>
+              <w:top w:type="dxa" w:w="70"/>
+              <w:left w:type="dxa" w:w="110"/>
+              <w:bottom w:type="dxa" w:w="70"/>
+              <w:right w:type="dxa" w:w="110"/>
+            </w:tcMar>
+            <w:vAlign w:val="center"/>
+          </w:tcPr>
+          <w:p>
+            <w:r>
+              <w:rPr>
+                <w:rFonts w:ascii="Calibri" w:cs="Calibri" w:eastAsia="Calibri" w:hAnsi="Calibri"/>
+                <w:b w:val="false"/>
+                <w:bCs w:val="false"/>
+                <w:color w:val="222222"/>
+                <w:sz w:val="20"/>
+                <w:szCs w:val="20"/>
+              </w:rPr>
+              <w:t xml:space="preserve">tick reali in corso</w:t>
+            </w:r>
+          </w:p>
+        </w:tc>
+      </w:tr>
+    </w:tbl>
+    <w:p>
+      <w:pPr>
+        <w:spacing w:before="100"/>
+      </w:pPr>
+      <w:r>
+        <w:rPr>
+          <w:rFonts w:ascii="Calibri" w:cs="Calibri" w:eastAsia="Calibri" w:hAnsi="Calibri"/>
+          <w:b w:val="false"/>
+          <w:bCs w:val="false"/>
+          <w:i w:val="false"/>
+          <w:iCs w:val="false"/>
+          <w:color w:val="222222"/>
+          <w:sz w:val="22"/>
+          <w:szCs w:val="22"/>
+        </w:rPr>
+        <w:t xml:space="preserve">Esempio del perché il TF conta: il </w:t>
+      </w:r>
+      <w:r>
+        <w:rPr>
+          <w:rFonts w:ascii="Calibri" w:cs="Calibri" w:eastAsia="Calibri" w:hAnsi="Calibri"/>
+          <w:b/>
+          <w:bCs/>
+          <w:i w:val="false"/>
+          <w:iCs w:val="false"/>
+          <w:color w:val="1F3A5F"/>
+          <w:sz w:val="22"/>
+          <w:szCs w:val="22"/>
+        </w:rPr>
+        <w:t xml:space="preserve">Nasdaq col SupertrendReversal</w:t>
+      </w:r>
+      <w:r>
+        <w:rPr>
+          <w:rFonts w:ascii="Calibri" w:cs="Calibri" w:eastAsia="Calibri" w:hAnsi="Calibri"/>
+          <w:b w:val="false"/>
+          <w:bCs w:val="false"/>
+          <w:i w:val="false"/>
+          <w:iCs w:val="false"/>
+          <w:color w:val="222222"/>
+          <w:sz w:val="22"/>
+          <w:szCs w:val="22"/>
+        </w:rPr>
+        <w:t xml:space="preserve"> in H4 era spazzatura (0,68); in </w:t>
+      </w:r>
+      <w:r>
+        <w:rPr>
+          <w:rFonts w:ascii="Calibri" w:cs="Calibri" w:eastAsia="Calibri" w:hAnsi="Calibri"/>
+          <w:b/>
+          <w:bCs/>
+          <w:i w:val="false"/>
+          <w:iCs w:val="false"/>
+          <w:color w:val="2E7D46"/>
+          <w:sz w:val="22"/>
+          <w:szCs w:val="22"/>
+        </w:rPr>
+        <w:t xml:space="preserve">H1 diventa 1,40 con drawdown 1,2%</w:t>
+      </w:r>
+      <w:r>
+        <w:rPr>
+          <w:rFonts w:ascii="Calibri" w:cs="Calibri" w:eastAsia="Calibri" w:hAnsi="Calibri"/>
+          <w:b w:val="false"/>
+          <w:bCs w:val="false"/>
+          <w:i w:val="false"/>
+          <w:iCs w:val="false"/>
+          <w:color w:val="222222"/>
+          <w:sz w:val="22"/>
+          <w:szCs w:val="22"/>
+        </w:rPr>
+        <w:t xml:space="preserve">. Stesso motore, stesso simbolo — solo il timeframe giusto.</w:t>
+      </w:r>
+    </w:p>
+    <w:p>
+      <w:pPr>
+        <w:pBdr>
+          <w:left w:val="single" w:color="2E5A8C" w:sz="24" w:space="12"/>
+        </w:pBdr>
+        <w:spacing w:after="140" w:before="320"/>
+      </w:pPr>
+      <w:r>
+        <w:rPr>
+          <w:rFonts w:ascii="Georgia" w:cs="Georgia" w:eastAsia="Georgia" w:hAnsi="Georgia"/>
+          <w:b/>
+          <w:bCs/>
+          <w:color w:val="2E5A8C"/>
+          <w:sz w:val="28"/>
+          <w:szCs w:val="28"/>
+        </w:rPr>
+        <w:t xml:space="preserve">2 · La squadra già in forward (8 EA validati)</w:t>
+      </w:r>
+    </w:p>
+    <w:p>
+      <w:pPr>
+        <w:pStyle w:val="ListParagraph"/>
+        <w:numPr>
+          <w:ilvl w:val="0"/>
+          <w:numId w:val="2"/>
+        </w:numPr>
+        <w:spacing w:after="80"/>
+      </w:pPr>
+      <w:r>
+        <w:rPr>
+          <w:rFonts w:ascii="Calibri" w:cs="Calibri" w:eastAsia="Calibri" w:hAnsi="Calibri"/>
+          <w:b/>
+          <w:bCs/>
+          <w:i w:val="false"/>
+          <w:iCs w:val="false"/>
+          <w:color w:val="1F3A5F"/>
+          <w:sz w:val="22"/>
+          <w:szCs w:val="22"/>
+        </w:rPr>
+        <w:t xml:space="preserve">5 SupertrendReversal</w:t>
+      </w:r>
+      <w:r>
+        <w:rPr>
+          <w:rFonts w:ascii="Calibri" w:cs="Calibri" w:eastAsia="Calibri" w:hAnsi="Calibri"/>
+          <w:b w:val="false"/>
+          <w:bCs w:val="false"/>
+          <w:i w:val="false"/>
+          <w:iCs w:val="false"/>
+          <w:color w:val="222222"/>
+          <w:sz w:val="22"/>
+          <w:szCs w:val="22"/>
+        </w:rPr>
+        <w:t xml:space="preserve">: Oro, Argento, DAX, Nikkei (H4) + Nasdaq (H1).</w:t>
+      </w:r>
+    </w:p>
+    <w:p>
+      <w:pPr>
+        <w:pStyle w:val="ListParagraph"/>
+        <w:numPr>
+          <w:ilvl w:val="0"/>
+          <w:numId w:val="2"/>
+        </w:numPr>
+        <w:spacing w:after="80"/>
+      </w:pPr>
+      <w:r>
+        <w:rPr>
+          <w:rFonts w:ascii="Calibri" w:cs="Calibri" w:eastAsia="Calibri" w:hAnsi="Calibri"/>
+          <w:b/>
+          <w:bCs/>
+          <w:i w:val="false"/>
+          <w:iCs w:val="false"/>
+          <w:color w:val="1F3A5F"/>
+          <w:sz w:val="22"/>
+          <w:szCs w:val="22"/>
+        </w:rPr>
+        <w:t xml:space="preserve">3 GoldenCross</w:t>
+      </w:r>
+      <w:r>
+        <w:rPr>
+          <w:rFonts w:ascii="Calibri" w:cs="Calibri" w:eastAsia="Calibri" w:hAnsi="Calibri"/>
+          <w:b w:val="false"/>
+          <w:bCs w:val="false"/>
+          <w:i w:val="false"/>
+          <w:iCs w:val="false"/>
+          <w:color w:val="222222"/>
+          <w:sz w:val="22"/>
+          <w:szCs w:val="22"/>
+        </w:rPr>
+        <w:t xml:space="preserve">: USDCHF, USDCAD, NZDUSD (H4) — strategia forex, diversifica dai metalli/indici.</w:t>
+      </w:r>
+    </w:p>
+    <w:p>
+      <w:r>
+        <w:rPr>
+          <w:rFonts w:ascii="Calibri" w:cs="Calibri" w:eastAsia="Calibri" w:hAnsi="Calibri"/>
+          <w:b w:val="false"/>
+          <w:bCs w:val="false"/>
+          <w:i w:val="false"/>
+          <w:iCs w:val="false"/>
+          <w:color w:val="222222"/>
+          <w:sz w:val="22"/>
+          <w:szCs w:val="22"/>
+        </w:rPr>
+        <w:t xml:space="preserve">Due strategie poco correlate, tutte a </w:t>
+      </w:r>
+      <w:r>
+        <w:rPr>
+          <w:rFonts w:ascii="Calibri" w:cs="Calibri" w:eastAsia="Calibri" w:hAnsi="Calibri"/>
+          <w:b/>
+          <w:bCs/>
+          <w:i w:val="false"/>
+          <w:iCs w:val="false"/>
+          <w:color w:val="2E7D46"/>
+          <w:sz w:val="22"/>
+          <w:szCs w:val="22"/>
+        </w:rPr>
+        <w:t xml:space="preserve">drawdown basso</w:t>
+      </w:r>
+      <w:r>
+        <w:rPr>
+          <w:rFonts w:ascii="Calibri" w:cs="Calibri" w:eastAsia="Calibri" w:hAnsi="Calibri"/>
+          <w:b w:val="false"/>
+          <w:bCs w:val="false"/>
+          <w:i w:val="false"/>
+          <w:iCs w:val="false"/>
+          <w:color w:val="222222"/>
+          <w:sz w:val="22"/>
+          <w:szCs w:val="22"/>
+        </w:rPr>
+        <w:t xml:space="preserve">. Ora raccolgo la pagella forward reale (~2-3 mesi).</w:t>
+      </w:r>
+    </w:p>
+    <w:p>
+      <w:pPr>
+        <w:pBdr>
+          <w:left w:val="single" w:color="B8860B" w:sz="24" w:space="12"/>
+        </w:pBdr>
+        <w:spacing w:after="140" w:before="320"/>
+      </w:pPr>
+      <w:r>
+        <w:rPr>
+          <w:rFonts w:ascii="Georgia" w:cs="Georgia" w:eastAsia="Georgia" w:hAnsi="Georgia"/>
+          <w:b/>
+          <w:bCs/>
+          <w:color w:val="B8860B"/>
+          <w:sz w:val="28"/>
+          <w:szCs w:val="28"/>
+        </w:rPr>
+        <w:t xml:space="preserve">3 · Poi la gestione: BE / trailing / parziale (studio in corso)</w:t>
+      </w:r>
+    </w:p>
+    <w:p>
+      <w:pPr>
+        <w:spacing w:after="120"/>
+      </w:pPr>
+      <w:r>
+        <w:rPr>
+          <w:rFonts w:ascii="Calibri" w:cs="Calibri" w:eastAsia="Calibri" w:hAnsi="Calibri"/>
+          <w:b w:val="false"/>
+          <w:bCs w:val="false"/>
+          <w:i w:val="false"/>
+          <w:iCs w:val="false"/>
+          <w:color w:val="222222"/>
+          <w:sz w:val="22"/>
+          <w:szCs w:val="22"/>
+        </w:rPr>
+        <w:t xml:space="preserve">Trovato il motore, </w:t>
+      </w:r>
+      <w:r>
+        <w:rPr>
+          <w:rFonts w:ascii="Calibri" w:cs="Calibri" w:eastAsia="Calibri" w:hAnsi="Calibri"/>
+          <w:b/>
+          <w:bCs/>
+          <w:i w:val="false"/>
+          <w:iCs w:val="false"/>
+          <w:color w:val="1F3A5F"/>
+          <w:sz w:val="22"/>
+          <w:szCs w:val="22"/>
+        </w:rPr>
+        <w:t xml:space="preserve">costruisco sopra la gestione</w:t>
+      </w:r>
+      <w:r>
+        <w:rPr>
+          <w:rFonts w:ascii="Calibri" w:cs="Calibri" w:eastAsia="Calibri" w:hAnsi="Calibri"/>
+          <w:b w:val="false"/>
+          <w:bCs w:val="false"/>
+          <w:i w:val="false"/>
+          <w:iCs w:val="false"/>
+          <w:color w:val="222222"/>
+          <w:sz w:val="22"/>
+          <w:szCs w:val="22"/>
+        </w:rPr>
+        <w:t xml:space="preserve"> e la testo a tick reali — proprio come dici tu: il trailing a tot punti serve a </w:t>
+      </w:r>
+      <w:r>
+        <w:rPr>
+          <w:rFonts w:ascii="Calibri" w:cs="Calibri" w:eastAsia="Calibri" w:hAnsi="Calibri"/>
+          <w:b/>
+          <w:bCs/>
+          <w:i w:val="false"/>
+          <w:iCs w:val="false"/>
+          <w:color w:val="B8860B"/>
+          <w:sz w:val="22"/>
+          <w:szCs w:val="22"/>
+        </w:rPr>
+        <w:t xml:space="preserve">non restituire i profitti sui ritracciamenti</w:t>
+      </w:r>
+      <w:r>
+        <w:rPr>
+          <w:rFonts w:ascii="Calibri" w:cs="Calibri" w:eastAsia="Calibri" w:hAnsi="Calibri"/>
+          <w:b w:val="false"/>
+          <w:bCs w:val="false"/>
+          <w:i w:val="false"/>
+          <w:iCs w:val="false"/>
+          <w:color w:val="222222"/>
+          <w:sz w:val="22"/>
+          <w:szCs w:val="22"/>
+        </w:rPr>
+        <w:t xml:space="preserve">. Sto misurando quale STRUTTURA rende di più sull’apertura di DAX e Nasdaq (M5):</w:t>
+      </w:r>
+    </w:p>
+    <w:tbl>
+      <w:tblPr>
+        <w:tblW w:type="dxa" w:w="9360"/>
+        <w:tblBorders>
+          <w:top w:val="single" w:color="B8860B" w:sz="6"/>
+          <w:left w:val="single" w:color="B8860B" w:sz="24"/>
+          <w:bottom w:val="single" w:color="B8860B" w:sz="6"/>
+          <w:right w:val="single" w:color="B8860B" w:sz="6"/>
+          <w:insideH w:val="none"/>
+          <w:insideV w:val="none"/>
+        </w:tblBorders>
+      </w:tblPr>
+      <w:tblGrid>
+        <w:gridCol w:w="9360"/>
+      </w:tblGrid>
+      <w:tr>
+        <w:tc>
+          <w:tcPr>
+            <w:tcW w:type="dxa" w:w="9360"/>
+            <w:shd w:fill="FBF3DD" w:color="auto" w:val="clear"/>
+            <w:tcMar>
+              <w:top w:type="dxa" w:w="120"/>
+              <w:left w:type="dxa" w:w="180"/>
+              <w:bottom w:type="dxa" w:w="120"/>
+              <w:right w:type="dxa" w:w="180"/>
+            </w:tcMar>
+          </w:tcPr>
+          <w:p>
+            <w:pPr>
+              <w:spacing w:after="60"/>
+            </w:pPr>
+            <w:r>
+              <w:rPr>
+                <w:rFonts w:ascii="Calibri" w:cs="Calibri" w:eastAsia="Calibri" w:hAnsi="Calibri"/>
+                <w:b/>
+                <w:bCs/>
+                <w:i w:val="false"/>
+                <w:iCs w:val="false"/>
+                <w:color w:val="B8860B"/>
+                <w:sz w:val="23"/>
+                <w:szCs w:val="23"/>
+              </w:rPr>
+              <w:t xml:space="preserve">Le strutture a confronto (16 combinazioni)</w:t>
+            </w:r>
+          </w:p>
+          <w:p>
+            <w:r>
+              <w:rPr>
+                <w:rFonts w:ascii="Calibri" w:cs="Calibri" w:eastAsia="Calibri" w:hAnsi="Calibri"/>
+                <w:b/>
+                <w:bCs/>
+                <w:i w:val="false"/>
+                <w:iCs w:val="false"/>
+                <w:color w:val="222222"/>
+                <w:sz w:val="22"/>
+                <w:szCs w:val="22"/>
+              </w:rPr>
+              <w:t xml:space="preserve">• Parziale/dimezza: </w:t>
+            </w:r>
+            <w:r>
+              <w:rPr>
+                <w:rFonts w:ascii="Calibri" w:cs="Calibri" w:eastAsia="Calibri" w:hAnsi="Calibri"/>
+                <w:b w:val="false"/>
+                <w:bCs w:val="false"/>
+                <w:i w:val="false"/>
+                <w:iCs w:val="false"/>
+                <w:color w:val="222222"/>
+                <w:sz w:val="22"/>
+                <w:szCs w:val="22"/>
+              </w:rPr>
+              <w:t xml:space="preserve">OFF · 50% a 1R</w:t>
+            </w:r>
+          </w:p>
+          <w:p>
+            <w:r>
+              <w:rPr>
+                <w:rFonts w:ascii="Calibri" w:cs="Calibri" w:eastAsia="Calibri" w:hAnsi="Calibri"/>
+                <w:b/>
+                <w:bCs/>
+                <w:i w:val="false"/>
+                <w:iCs w:val="false"/>
+                <w:color w:val="222222"/>
+                <w:sz w:val="22"/>
+                <w:szCs w:val="22"/>
+              </w:rPr>
+              <w:t xml:space="preserve">• Break-even: </w:t>
+            </w:r>
+            <w:r>
+              <w:rPr>
+                <w:rFonts w:ascii="Calibri" w:cs="Calibri" w:eastAsia="Calibri" w:hAnsi="Calibri"/>
+                <w:b w:val="false"/>
+                <w:bCs w:val="false"/>
+                <w:i w:val="false"/>
+                <w:iCs w:val="false"/>
+                <w:color w:val="222222"/>
+                <w:sz w:val="22"/>
+                <w:szCs w:val="22"/>
+              </w:rPr>
+              <w:t xml:space="preserve">OFF · dopo la parziale · indipendente a 1R</w:t>
+            </w:r>
+          </w:p>
+          <w:p>
+            <w:r>
+              <w:rPr>
+                <w:rFonts w:ascii="Calibri" w:cs="Calibri" w:eastAsia="Calibri" w:hAnsi="Calibri"/>
+                <w:b/>
+                <w:bCs/>
+                <w:i w:val="false"/>
+                <w:iCs w:val="false"/>
+                <w:color w:val="222222"/>
+                <w:sz w:val="22"/>
+                <w:szCs w:val="22"/>
+              </w:rPr>
+              <w:t xml:space="preserve">• Trailing: </w:t>
+            </w:r>
+            <w:r>
+              <w:rPr>
+                <w:rFonts w:ascii="Calibri" w:cs="Calibri" w:eastAsia="Calibri" w:hAnsi="Calibri"/>
+                <w:b w:val="false"/>
+                <w:bCs w:val="false"/>
+                <w:i w:val="false"/>
+                <w:iCs w:val="false"/>
+                <w:color w:val="222222"/>
+                <w:sz w:val="22"/>
+                <w:szCs w:val="22"/>
+              </w:rPr>
+              <w:t xml:space="preserve">OFF · ATR · candela precedente · a punti fissi (anti-ritracciamento)</w:t>
+            </w:r>
+          </w:p>
+        </w:tc>
+      </w:tr>
+    </w:tbl>
+    <w:p>
+      <w:pPr>
+        <w:spacing w:before="120"/>
+      </w:pPr>
+      <w:r>
+        <w:rPr>
+          <w:rFonts w:ascii="Calibri" w:cs="Calibri" w:eastAsia="Calibri" w:hAnsi="Calibri"/>
+          <w:b w:val="false"/>
+          <w:bCs w:val="false"/>
+          <w:i w:val="false"/>
+          <w:iCs w:val="false"/>
+          <w:color w:val="222222"/>
+          <w:sz w:val="22"/>
+          <w:szCs w:val="22"/>
+        </w:rPr>
+        <w:t xml:space="preserve">Il test dirà, </w:t>
+      </w:r>
+      <w:r>
+        <w:rPr>
+          <w:rFonts w:ascii="Calibri" w:cs="Calibri" w:eastAsia="Calibri" w:hAnsi="Calibri"/>
+          <w:b/>
+          <w:bCs/>
+          <w:i w:val="false"/>
+          <w:iCs w:val="false"/>
+          <w:color w:val="B8860B"/>
+          <w:sz w:val="22"/>
+          <w:szCs w:val="22"/>
+        </w:rPr>
+        <w:t xml:space="preserve">sui numeri</w:t>
+      </w:r>
+      <w:r>
+        <w:rPr>
+          <w:rFonts w:ascii="Calibri" w:cs="Calibri" w:eastAsia="Calibri" w:hAnsi="Calibri"/>
+          <w:b w:val="false"/>
+          <w:bCs w:val="false"/>
+          <w:i w:val="false"/>
+          <w:iCs w:val="false"/>
+          <w:color w:val="222222"/>
+          <w:sz w:val="22"/>
+          <w:szCs w:val="22"/>
+        </w:rPr>
+        <w:t xml:space="preserve">, se all’apertura conviene “solo trailing”, “dimezza + BE”, “BE + trailing”, ecc. — </w:t>
+      </w:r>
+      <w:r>
+        <w:rPr>
+          <w:rFonts w:ascii="Calibri" w:cs="Calibri" w:eastAsia="Calibri" w:hAnsi="Calibri"/>
+          <w:b/>
+          <w:bCs/>
+          <w:i w:val="false"/>
+          <w:iCs w:val="false"/>
+          <w:color w:val="1F3A5F"/>
+          <w:sz w:val="22"/>
+          <w:szCs w:val="22"/>
+        </w:rPr>
+        <w:t xml:space="preserve">una risposta diversa per il DAX e per il Nasdaq</w:t>
+      </w:r>
+      <w:r>
+        <w:rPr>
+          <w:rFonts w:ascii="Calibri" w:cs="Calibri" w:eastAsia="Calibri" w:hAnsi="Calibri"/>
+          <w:b w:val="false"/>
+          <w:bCs w:val="false"/>
+          <w:i w:val="false"/>
+          <w:iCs w:val="false"/>
+          <w:color w:val="222222"/>
+          <w:sz w:val="22"/>
+          <w:szCs w:val="22"/>
+        </w:rPr>
+        <w:t xml:space="preserve">, non a intuito.</w:t>
       </w:r>
     </w:p>
     <w:p>

</xml_diff>

<commit_message>
Fix Word non apribile: rimosso paragrafo annidato nella tabella imbuto + relazione fontTable
Causa: la cella-numero dell'imbuto conteneva un Paragraph dentro un Paragraph (w:p in w:p = schema non valido -> Word rifiutava). Validazione XSD ora OK.

Co-Authored-By: Claude Opus 4.8 <noreply@anthropic.com>
Claude-Session: https://claude.ai/code/session_01CDYK6wPvja1Sh6AQwJLSEd
</commit_message>
<xml_diff>
--- a/piano_trading/PIANO_PER_EMILIANO.docx
+++ b/piano_trading/PIANO_PER_EMILIANO.docx
@@ -8,12 +8,12 @@
       </w:pPr>
       <w:r>
         <w:rPr>
-          <w:rFonts w:ascii="Georgia" w:cs="Georgia" w:eastAsia="Georgia" w:hAnsi="Georgia"/>
           <w:b/>
           <w:bCs/>
           <w:color w:val="1F3A5F"/>
           <w:sz w:val="52"/>
           <w:szCs w:val="52"/>
+          <w:rFonts w:ascii="Georgia" w:cs="Georgia" w:eastAsia="Georgia" w:hAnsi="Georgia"/>
         </w:rPr>
         <w:t xml:space="preserve">Il mio progetto di trading</w:t>
       </w:r>
@@ -24,12 +24,12 @@
       </w:pPr>
       <w:r>
         <w:rPr>
-          <w:rFonts w:ascii="Georgia" w:cs="Georgia" w:eastAsia="Georgia" w:hAnsi="Georgia"/>
           <w:b/>
           <w:bCs/>
           <w:color w:val="B8860B"/>
           <w:sz w:val="34"/>
           <w:szCs w:val="34"/>
+          <w:rFonts w:ascii="Georgia" w:cs="Georgia" w:eastAsia="Georgia" w:hAnsi="Georgia"/>
         </w:rPr>
         <w:t xml:space="preserve">per Emiliano</w:t>
       </w:r>
@@ -85,12 +85,12 @@
             </w:pPr>
             <w:r>
               <w:rPr>
-                <w:rFonts w:ascii="Georgia" w:cs="Georgia" w:eastAsia="Georgia" w:hAnsi="Georgia"/>
                 <w:b/>
                 <w:bCs/>
                 <w:color w:val="B8860B"/>
                 <w:sz w:val="24"/>
                 <w:szCs w:val="24"/>
+                <w:rFonts w:ascii="Georgia" w:cs="Georgia" w:eastAsia="Georgia" w:hAnsi="Georgia"/>
               </w:rPr>
               <w:t xml:space="preserve">🧭  Il principio che guida tutto</w:t>
             </w:r>
@@ -98,7 +98,6 @@
           <w:p>
             <w:r>
               <w:rPr>
-                <w:rFonts w:ascii="Calibri" w:cs="Calibri" w:eastAsia="Calibri" w:hAnsi="Calibri"/>
                 <w:b w:val="false"/>
                 <w:bCs w:val="false"/>
                 <w:i w:val="false"/>
@@ -106,12 +105,12 @@
                 <w:color w:val="222222"/>
                 <w:sz w:val="22"/>
                 <w:szCs w:val="22"/>
+                <w:rFonts w:ascii="Calibri" w:cs="Calibri" w:eastAsia="Calibri" w:hAnsi="Calibri"/>
               </w:rPr>
               <w:t xml:space="preserve">Per ogni strategia, </w:t>
             </w:r>
             <w:r>
               <w:rPr>
-                <w:rFonts w:ascii="Calibri" w:cs="Calibri" w:eastAsia="Calibri" w:hAnsi="Calibri"/>
                 <w:b/>
                 <w:bCs/>
                 <w:i w:val="false"/>
@@ -119,12 +118,12 @@
                 <w:color w:val="1F3A5F"/>
                 <w:sz w:val="22"/>
                 <w:szCs w:val="22"/>
+                <w:rFonts w:ascii="Calibri" w:cs="Calibri" w:eastAsia="Calibri" w:hAnsi="Calibri"/>
               </w:rPr>
               <w:t xml:space="preserve">prima trovo il MOTORE</w:t>
             </w:r>
             <w:r>
               <w:rPr>
-                <w:rFonts w:ascii="Calibri" w:cs="Calibri" w:eastAsia="Calibri" w:hAnsi="Calibri"/>
                 <w:b w:val="false"/>
                 <w:bCs w:val="false"/>
                 <w:i w:val="false"/>
@@ -132,12 +131,12 @@
                 <w:color w:val="222222"/>
                 <w:sz w:val="22"/>
                 <w:szCs w:val="22"/>
+                <w:rFonts w:ascii="Calibri" w:cs="Calibri" w:eastAsia="Calibri" w:hAnsi="Calibri"/>
               </w:rPr>
               <w:t xml:space="preserve"> (l’ingresso con vero vantaggio, su quale simbolo e timeframe). </w:t>
             </w:r>
             <w:r>
               <w:rPr>
-                <w:rFonts w:ascii="Calibri" w:cs="Calibri" w:eastAsia="Calibri" w:hAnsi="Calibri"/>
                 <w:b/>
                 <w:bCs/>
                 <w:i w:val="false"/>
@@ -145,12 +144,12 @@
                 <w:color w:val="1F3A5F"/>
                 <w:sz w:val="22"/>
                 <w:szCs w:val="22"/>
+                <w:rFonts w:ascii="Calibri" w:cs="Calibri" w:eastAsia="Calibri" w:hAnsi="Calibri"/>
               </w:rPr>
               <w:t xml:space="preserve">Solo dopo</w:t>
             </w:r>
             <w:r>
               <w:rPr>
-                <w:rFonts w:ascii="Calibri" w:cs="Calibri" w:eastAsia="Calibri" w:hAnsi="Calibri"/>
                 <w:b w:val="false"/>
                 <w:bCs w:val="false"/>
                 <w:i w:val="false"/>
@@ -158,12 +157,12 @@
                 <w:color w:val="222222"/>
                 <w:sz w:val="22"/>
                 <w:szCs w:val="22"/>
+                <w:rFonts w:ascii="Calibri" w:cs="Calibri" w:eastAsia="Calibri" w:hAnsi="Calibri"/>
               </w:rPr>
               <w:t xml:space="preserve"> ci costruisco sopra la </w:t>
             </w:r>
             <w:r>
               <w:rPr>
-                <w:rFonts w:ascii="Calibri" w:cs="Calibri" w:eastAsia="Calibri" w:hAnsi="Calibri"/>
                 <w:b/>
                 <w:bCs/>
                 <w:i w:val="false"/>
@@ -171,12 +170,12 @@
                 <w:color w:val="1F3A5F"/>
                 <w:sz w:val="22"/>
                 <w:szCs w:val="22"/>
+                <w:rFonts w:ascii="Calibri" w:cs="Calibri" w:eastAsia="Calibri" w:hAnsi="Calibri"/>
               </w:rPr>
               <w:t xml:space="preserve">gestione</w:t>
             </w:r>
             <w:r>
               <w:rPr>
-                <w:rFonts w:ascii="Calibri" w:cs="Calibri" w:eastAsia="Calibri" w:hAnsi="Calibri"/>
                 <w:b w:val="false"/>
                 <w:bCs w:val="false"/>
                 <w:i w:val="false"/>
@@ -184,12 +183,12 @@
                 <w:color w:val="222222"/>
                 <w:sz w:val="22"/>
                 <w:szCs w:val="22"/>
+                <w:rFonts w:ascii="Calibri" w:cs="Calibri" w:eastAsia="Calibri" w:hAnsi="Calibri"/>
               </w:rPr>
               <w:t xml:space="preserve">: break-even, trailing a tot punti per evitare i ritracciamenti, chiusura parziale. </w:t>
             </w:r>
             <w:r>
               <w:rPr>
-                <w:rFonts w:ascii="Calibri" w:cs="Calibri" w:eastAsia="Calibri" w:hAnsi="Calibri"/>
                 <w:b w:val="false"/>
                 <w:bCs w:val="false"/>
                 <w:i w:val="false"/>
@@ -197,6 +196,7 @@
                 <w:color w:val="222222"/>
                 <w:sz w:val="22"/>
                 <w:szCs w:val="22"/>
+                <w:rFonts w:ascii="Calibri" w:cs="Calibri" w:eastAsia="Calibri" w:hAnsi="Calibri"/>
               </w:rPr>
               <w:t xml:space="preserve">Motore e gestione si testano separati — così so cosa funziona e perché.</w:t>
             </w:r>
@@ -209,16 +209,16 @@
         <w:pBdr>
           <w:left w:val="single" w:color="2E5A8C" w:sz="24" w:space="12"/>
         </w:pBdr>
-        <w:spacing w:after="140" w:before="320"/>
-      </w:pPr>
-      <w:r>
-        <w:rPr>
-          <w:rFonts w:ascii="Georgia" w:cs="Georgia" w:eastAsia="Georgia" w:hAnsi="Georgia"/>
+        <w:spacing w:before="320" w:after="140"/>
+      </w:pPr>
+      <w:r>
+        <w:rPr>
           <w:b/>
           <w:bCs/>
           <w:color w:val="2E5A8C"/>
           <w:sz w:val="28"/>
           <w:szCs w:val="28"/>
+          <w:rFonts w:ascii="Georgia" w:cs="Georgia" w:eastAsia="Georgia" w:hAnsi="Georgia"/>
         </w:rPr>
         <w:t xml:space="preserve">Chi sono e perché faccio così</w:t>
       </w:r>
@@ -229,46 +229,45 @@
       </w:pPr>
       <w:r>
         <w:rPr>
-          <w:rFonts w:ascii="Calibri" w:cs="Calibri" w:eastAsia="Calibri" w:hAnsi="Calibri"/>
-          <w:b w:val="false"/>
-          <w:bCs w:val="false"/>
-          <w:i w:val="false"/>
-          <w:iCs w:val="false"/>
-          <w:color w:val="222222"/>
-          <w:sz w:val="22"/>
-          <w:szCs w:val="22"/>
+          <w:b w:val="false"/>
+          <w:bCs w:val="false"/>
+          <w:i w:val="false"/>
+          <w:iCs w:val="false"/>
+          <w:color w:val="222222"/>
+          <w:sz w:val="22"/>
+          <w:szCs w:val="22"/>
+          <w:rFonts w:ascii="Calibri" w:cs="Calibri" w:eastAsia="Calibri" w:hAnsi="Calibri"/>
         </w:rPr>
         <w:t xml:space="preserve">Sono un trader retail, ma </w:t>
       </w:r>
       <w:r>
         <w:rPr>
-          <w:rFonts w:ascii="Calibri" w:cs="Calibri" w:eastAsia="Calibri" w:hAnsi="Calibri"/>
-          <w:b/>
-          <w:bCs/>
-          <w:i w:val="false"/>
-          <w:iCs w:val="false"/>
-          <w:color w:val="222222"/>
-          <w:sz w:val="22"/>
-          <w:szCs w:val="22"/>
+          <w:b/>
+          <w:bCs/>
+          <w:i w:val="false"/>
+          <w:iCs w:val="false"/>
+          <w:color w:val="222222"/>
+          <w:sz w:val="22"/>
+          <w:szCs w:val="22"/>
+          <w:rFonts w:ascii="Calibri" w:cs="Calibri" w:eastAsia="Calibri" w:hAnsi="Calibri"/>
         </w:rPr>
         <w:t xml:space="preserve">lavoro a tempo pieno e ho poco tempo per stare davanti ai grafici.</w:t>
       </w:r>
       <w:r>
         <w:rPr>
-          <w:rFonts w:ascii="Calibri" w:cs="Calibri" w:eastAsia="Calibri" w:hAnsi="Calibri"/>
-          <w:b w:val="false"/>
-          <w:bCs w:val="false"/>
-          <w:i w:val="false"/>
-          <w:iCs w:val="false"/>
-          <w:color w:val="222222"/>
-          <w:sz w:val="22"/>
-          <w:szCs w:val="22"/>
+          <w:b w:val="false"/>
+          <w:bCs w:val="false"/>
+          <w:i w:val="false"/>
+          <w:iCs w:val="false"/>
+          <w:color w:val="222222"/>
+          <w:sz w:val="22"/>
+          <w:szCs w:val="22"/>
+          <w:rFonts w:ascii="Calibri" w:cs="Calibri" w:eastAsia="Calibri" w:hAnsi="Calibri"/>
         </w:rPr>
         <w:t xml:space="preserve"> Per questo non punto sul discrezionale: sto costruendo, con metodo, una </w:t>
       </w:r>
       <w:r>
         <w:rPr>
-          <w:rFonts w:ascii="Calibri" w:cs="Calibri" w:eastAsia="Calibri" w:hAnsi="Calibri"/>
           <w:b/>
           <w:bCs/>
           <w:i w:val="false"/>
@@ -276,45 +275,46 @@
           <w:color w:val="1F3A5F"/>
           <w:sz w:val="22"/>
           <w:szCs w:val="22"/>
+          <w:rFonts w:ascii="Calibri" w:cs="Calibri" w:eastAsia="Calibri" w:hAnsi="Calibri"/>
         </w:rPr>
         <w:t xml:space="preserve">“squadra” di Expert Advisor (EA)</w:t>
       </w:r>
       <w:r>
         <w:rPr>
-          <w:rFonts w:ascii="Calibri" w:cs="Calibri" w:eastAsia="Calibri" w:hAnsi="Calibri"/>
-          <w:b w:val="false"/>
-          <w:bCs w:val="false"/>
-          <w:i w:val="false"/>
-          <w:iCs w:val="false"/>
-          <w:color w:val="222222"/>
-          <w:sz w:val="22"/>
-          <w:szCs w:val="22"/>
+          <w:b w:val="false"/>
+          <w:bCs w:val="false"/>
+          <w:i w:val="false"/>
+          <w:iCs w:val="false"/>
+          <w:color w:val="222222"/>
+          <w:sz w:val="22"/>
+          <w:szCs w:val="22"/>
+          <w:rFonts w:ascii="Calibri" w:cs="Calibri" w:eastAsia="Calibri" w:hAnsi="Calibri"/>
         </w:rPr>
         <w:t xml:space="preserve"> che — dopo test rigorosi — </w:t>
       </w:r>
       <w:r>
         <w:rPr>
-          <w:rFonts w:ascii="Calibri" w:cs="Calibri" w:eastAsia="Calibri" w:hAnsi="Calibri"/>
-          <w:b/>
-          <w:bCs/>
-          <w:i w:val="false"/>
-          <w:iCs w:val="false"/>
-          <w:color w:val="222222"/>
-          <w:sz w:val="22"/>
-          <w:szCs w:val="22"/>
+          <w:b/>
+          <w:bCs/>
+          <w:i w:val="false"/>
+          <w:iCs w:val="false"/>
+          <w:color w:val="222222"/>
+          <w:sz w:val="22"/>
+          <w:szCs w:val="22"/>
+          <w:rFonts w:ascii="Calibri" w:cs="Calibri" w:eastAsia="Calibri" w:hAnsi="Calibri"/>
         </w:rPr>
         <w:t xml:space="preserve">girano da soli</w:t>
       </w:r>
       <w:r>
         <w:rPr>
-          <w:rFonts w:ascii="Calibri" w:cs="Calibri" w:eastAsia="Calibri" w:hAnsi="Calibri"/>
-          <w:b w:val="false"/>
-          <w:bCs w:val="false"/>
-          <w:i w:val="false"/>
-          <w:iCs w:val="false"/>
-          <w:color w:val="222222"/>
-          <w:sz w:val="22"/>
-          <w:szCs w:val="22"/>
+          <w:b w:val="false"/>
+          <w:bCs w:val="false"/>
+          <w:i w:val="false"/>
+          <w:iCs w:val="false"/>
+          <w:color w:val="222222"/>
+          <w:sz w:val="22"/>
+          <w:szCs w:val="22"/>
+          <w:rFonts w:ascii="Calibri" w:cs="Calibri" w:eastAsia="Calibri" w:hAnsi="Calibri"/>
         </w:rPr>
         <w:t xml:space="preserve"> su demo, e poi (se reggono) su una prop firm.</w:t>
       </w:r>
@@ -322,20 +322,19 @@
     <w:p>
       <w:r>
         <w:rPr>
-          <w:rFonts w:ascii="Calibri" w:cs="Calibri" w:eastAsia="Calibri" w:hAnsi="Calibri"/>
-          <w:b w:val="false"/>
-          <w:bCs w:val="false"/>
-          <w:i w:val="false"/>
-          <w:iCs w:val="false"/>
-          <w:color w:val="222222"/>
-          <w:sz w:val="22"/>
-          <w:szCs w:val="22"/>
+          <w:b w:val="false"/>
+          <w:bCs w:val="false"/>
+          <w:i w:val="false"/>
+          <w:iCs w:val="false"/>
+          <w:color w:val="222222"/>
+          <w:sz w:val="22"/>
+          <w:szCs w:val="22"/>
+          <w:rFonts w:ascii="Calibri" w:cs="Calibri" w:eastAsia="Calibri" w:hAnsi="Calibri"/>
         </w:rPr>
         <w:t xml:space="preserve">Non è improvvisazione: ogni decisione la prendo </w:t>
       </w:r>
       <w:r>
         <w:rPr>
-          <w:rFonts w:ascii="Calibri" w:cs="Calibri" w:eastAsia="Calibri" w:hAnsi="Calibri"/>
           <w:b/>
           <w:bCs/>
           <w:i w:val="false"/>
@@ -343,19 +342,20 @@
           <w:color w:val="B8860B"/>
           <w:sz w:val="22"/>
           <w:szCs w:val="22"/>
+          <w:rFonts w:ascii="Calibri" w:cs="Calibri" w:eastAsia="Calibri" w:hAnsi="Calibri"/>
         </w:rPr>
         <w:t xml:space="preserve">sui numeri</w:t>
       </w:r>
       <w:r>
         <w:rPr>
-          <w:rFonts w:ascii="Calibri" w:cs="Calibri" w:eastAsia="Calibri" w:hAnsi="Calibri"/>
-          <w:b w:val="false"/>
-          <w:bCs w:val="false"/>
-          <w:i w:val="false"/>
-          <w:iCs w:val="false"/>
-          <w:color w:val="222222"/>
-          <w:sz w:val="22"/>
-          <w:szCs w:val="22"/>
+          <w:b w:val="false"/>
+          <w:bCs w:val="false"/>
+          <w:i w:val="false"/>
+          <w:iCs w:val="false"/>
+          <w:color w:val="222222"/>
+          <w:sz w:val="22"/>
+          <w:szCs w:val="22"/>
+          <w:rFonts w:ascii="Calibri" w:cs="Calibri" w:eastAsia="Calibri" w:hAnsi="Calibri"/>
         </w:rPr>
         <w:t xml:space="preserve">, non a sensazione.</w:t>
       </w:r>
@@ -365,16 +365,16 @@
         <w:pBdr>
           <w:left w:val="single" w:color="2E5A8C" w:sz="24" w:space="12"/>
         </w:pBdr>
-        <w:spacing w:after="140" w:before="320"/>
-      </w:pPr>
-      <w:r>
-        <w:rPr>
-          <w:rFonts w:ascii="Georgia" w:cs="Georgia" w:eastAsia="Georgia" w:hAnsi="Georgia"/>
+        <w:spacing w:before="320" w:after="140"/>
+      </w:pPr>
+      <w:r>
+        <w:rPr>
           <w:b/>
           <w:bCs/>
           <w:color w:val="2E5A8C"/>
           <w:sz w:val="28"/>
           <w:szCs w:val="28"/>
+          <w:rFonts w:ascii="Georgia" w:cs="Georgia" w:eastAsia="Georgia" w:hAnsi="Georgia"/>
         </w:rPr>
         <w:t xml:space="preserve">L’obiettivo, in due fasi</w:t>
       </w:r>
@@ -390,7 +390,6 @@
       </w:pPr>
       <w:r>
         <w:rPr>
-          <w:rFonts w:ascii="Calibri" w:cs="Calibri" w:eastAsia="Calibri" w:hAnsi="Calibri"/>
           <w:b/>
           <w:bCs/>
           <w:i w:val="false"/>
@@ -398,19 +397,20 @@
           <w:color w:val="1F3A5F"/>
           <w:sz w:val="22"/>
           <w:szCs w:val="22"/>
+          <w:rFonts w:ascii="Calibri" w:cs="Calibri" w:eastAsia="Calibri" w:hAnsi="Calibri"/>
         </w:rPr>
         <w:t xml:space="preserve">Squadra di EA autonomi e validati</w:t>
       </w:r>
       <w:r>
         <w:rPr>
-          <w:rFonts w:ascii="Calibri" w:cs="Calibri" w:eastAsia="Calibri" w:hAnsi="Calibri"/>
-          <w:b w:val="false"/>
-          <w:bCs w:val="false"/>
-          <w:i w:val="false"/>
-          <w:iCs w:val="false"/>
-          <w:color w:val="222222"/>
-          <w:sz w:val="22"/>
-          <w:szCs w:val="22"/>
+          <w:b w:val="false"/>
+          <w:bCs w:val="false"/>
+          <w:i w:val="false"/>
+          <w:iCs w:val="false"/>
+          <w:color w:val="222222"/>
+          <w:sz w:val="22"/>
+          <w:szCs w:val="22"/>
+          <w:rFonts w:ascii="Calibri" w:cs="Calibri" w:eastAsia="Calibri" w:hAnsi="Calibri"/>
         </w:rPr>
         <w:t xml:space="preserve"> — pochi EA solidi, diversificati, che lavorano mentre io sono al lavoro.</w:t>
       </w:r>
@@ -426,7 +426,6 @@
       </w:pPr>
       <w:r>
         <w:rPr>
-          <w:rFonts w:ascii="Calibri" w:cs="Calibri" w:eastAsia="Calibri" w:hAnsi="Calibri"/>
           <w:b/>
           <w:bCs/>
           <w:i w:val="false"/>
@@ -434,19 +433,20 @@
           <w:color w:val="1F3A5F"/>
           <w:sz w:val="22"/>
           <w:szCs w:val="22"/>
+          <w:rFonts w:ascii="Calibri" w:cs="Calibri" w:eastAsia="Calibri" w:hAnsi="Calibri"/>
         </w:rPr>
         <w:t xml:space="preserve">Progetto prop</w:t>
       </w:r>
       <w:r>
         <w:rPr>
-          <w:rFonts w:ascii="Calibri" w:cs="Calibri" w:eastAsia="Calibri" w:hAnsi="Calibri"/>
-          <w:b w:val="false"/>
-          <w:bCs w:val="false"/>
-          <w:i w:val="false"/>
-          <w:iCs w:val="false"/>
-          <w:color w:val="222222"/>
-          <w:sz w:val="22"/>
-          <w:szCs w:val="22"/>
+          <w:b w:val="false"/>
+          <w:bCs w:val="false"/>
+          <w:i w:val="false"/>
+          <w:iCs w:val="false"/>
+          <w:color w:val="222222"/>
+          <w:sz w:val="22"/>
+          <w:szCs w:val="22"/>
+          <w:rFonts w:ascii="Calibri" w:cs="Calibri" w:eastAsia="Calibri" w:hAnsi="Calibri"/>
         </w:rPr>
         <w:t xml:space="preserve"> — portare i migliori su una prop firm (riferimento FTMO), dopo averli provati con le stesse regole.</w:t>
       </w:r>
@@ -456,16 +456,16 @@
         <w:pBdr>
           <w:left w:val="single" w:color="2E5A8C" w:sz="24" w:space="12"/>
         </w:pBdr>
-        <w:spacing w:after="140" w:before="320"/>
-      </w:pPr>
-      <w:r>
-        <w:rPr>
-          <w:rFonts w:ascii="Georgia" w:cs="Georgia" w:eastAsia="Georgia" w:hAnsi="Georgia"/>
+        <w:spacing w:before="320" w:after="140"/>
+      </w:pPr>
+      <w:r>
+        <w:rPr>
           <w:b/>
           <w:bCs/>
           <w:color w:val="2E5A8C"/>
           <w:sz w:val="28"/>
           <w:szCs w:val="28"/>
+          <w:rFonts w:ascii="Georgia" w:cs="Georgia" w:eastAsia="Georgia" w:hAnsi="Georgia"/>
         </w:rPr>
         <w:t xml:space="preserve">Il metodo — un “imbuto” a 4 passi</w:t>
       </w:r>
@@ -476,7 +476,6 @@
       </w:pPr>
       <w:r>
         <w:rPr>
-          <w:rFonts w:ascii="Calibri" w:cs="Calibri" w:eastAsia="Calibri" w:hAnsi="Calibri"/>
           <w:b w:val="false"/>
           <w:bCs w:val="false"/>
           <w:i/>
@@ -484,6 +483,7 @@
           <w:color w:val="555555"/>
           <w:sz w:val="22"/>
           <w:szCs w:val="22"/>
+          <w:rFonts w:ascii="Calibri" w:cs="Calibri" w:eastAsia="Calibri" w:hAnsi="Calibri"/>
         </w:rPr>
         <w:t xml:space="preserve">Ogni strategia passa da questo filtro e sopravvive solo se merita:</w:t>
       </w:r>
@@ -519,22 +519,20 @@
             <w:vAlign w:val="center"/>
           </w:tcPr>
           <w:p>
-            <w:p>
-              <w:pPr>
-                <w:jc w:val="center"/>
-              </w:pPr>
-              <w:r>
-                <w:rPr>
-                  <w:rFonts w:ascii="Georgia" w:cs="Georgia" w:eastAsia="Georgia" w:hAnsi="Georgia"/>
-                  <w:b/>
-                  <w:bCs/>
-                  <w:color w:val="FFFFFF"/>
-                  <w:sz w:val="30"/>
-                  <w:szCs w:val="30"/>
-                </w:rPr>
-                <w:t xml:space="preserve">1</w:t>
-              </w:r>
-            </w:p>
+            <w:pPr>
+              <w:jc w:val="center"/>
+            </w:pPr>
+            <w:r>
+              <w:rPr>
+                <w:b/>
+                <w:bCs/>
+                <w:color w:val="FFFFFF"/>
+                <w:sz w:val="30"/>
+                <w:szCs w:val="30"/>
+                <w:rFonts w:ascii="Georgia" w:cs="Georgia" w:eastAsia="Georgia" w:hAnsi="Georgia"/>
+              </w:rPr>
+              <w:t xml:space="preserve">1</w:t>
+            </w:r>
           </w:p>
         </w:tc>
         <w:tc>
@@ -552,7 +550,6 @@
           <w:p>
             <w:r>
               <w:rPr>
-                <w:rFonts w:ascii="Calibri" w:cs="Calibri" w:eastAsia="Calibri" w:hAnsi="Calibri"/>
                 <w:b/>
                 <w:bCs/>
                 <w:i w:val="false"/>
@@ -560,6 +557,7 @@
                 <w:color w:val="2E5A8C"/>
                 <w:sz w:val="22"/>
                 <w:szCs w:val="22"/>
+                <w:rFonts w:ascii="Calibri" w:cs="Calibri" w:eastAsia="Calibri" w:hAnsi="Calibri"/>
               </w:rPr>
               <w:t xml:space="preserve">SCOPERTA</w:t>
             </w:r>
@@ -580,7 +578,6 @@
           <w:p>
             <w:r>
               <w:rPr>
-                <w:rFonts w:ascii="Calibri" w:cs="Calibri" w:eastAsia="Calibri" w:hAnsi="Calibri"/>
                 <w:b w:val="false"/>
                 <w:bCs w:val="false"/>
                 <w:i w:val="false"/>
@@ -588,6 +585,7 @@
                 <w:color w:val="222222"/>
                 <w:sz w:val="21"/>
                 <w:szCs w:val="21"/>
+                <w:rFonts w:ascii="Calibri" w:cs="Calibri" w:eastAsia="Calibri" w:hAnsi="Calibri"/>
               </w:rPr>
               <w:t xml:space="preserve">Backtest OHLC di ogni motore su 48 simboli e più timeframe (H4/H1/M30/M15/M5): dove ha davvero un vantaggio?</w:t>
             </w:r>
@@ -608,22 +606,20 @@
             <w:vAlign w:val="center"/>
           </w:tcPr>
           <w:p>
-            <w:p>
-              <w:pPr>
-                <w:jc w:val="center"/>
-              </w:pPr>
-              <w:r>
-                <w:rPr>
-                  <w:rFonts w:ascii="Georgia" w:cs="Georgia" w:eastAsia="Georgia" w:hAnsi="Georgia"/>
-                  <w:b/>
-                  <w:bCs/>
-                  <w:color w:val="FFFFFF"/>
-                  <w:sz w:val="30"/>
-                  <w:szCs w:val="30"/>
-                </w:rPr>
-                <w:t xml:space="preserve">2</w:t>
-              </w:r>
-            </w:p>
+            <w:pPr>
+              <w:jc w:val="center"/>
+            </w:pPr>
+            <w:r>
+              <w:rPr>
+                <w:b/>
+                <w:bCs/>
+                <w:color w:val="FFFFFF"/>
+                <w:sz w:val="30"/>
+                <w:szCs w:val="30"/>
+                <w:rFonts w:ascii="Georgia" w:cs="Georgia" w:eastAsia="Georgia" w:hAnsi="Georgia"/>
+              </w:rPr>
+              <w:t xml:space="preserve">2</w:t>
+            </w:r>
           </w:p>
         </w:tc>
         <w:tc>
@@ -641,7 +637,6 @@
           <w:p>
             <w:r>
               <w:rPr>
-                <w:rFonts w:ascii="Calibri" w:cs="Calibri" w:eastAsia="Calibri" w:hAnsi="Calibri"/>
                 <w:b/>
                 <w:bCs/>
                 <w:i w:val="false"/>
@@ -649,6 +644,7 @@
                 <w:color w:val="2E5A8C"/>
                 <w:sz w:val="22"/>
                 <w:szCs w:val="22"/>
+                <w:rFonts w:ascii="Calibri" w:cs="Calibri" w:eastAsia="Calibri" w:hAnsi="Calibri"/>
               </w:rPr>
               <w:t xml:space="preserve">VALIDAZIONE</w:t>
             </w:r>
@@ -669,7 +665,6 @@
           <w:p>
             <w:r>
               <w:rPr>
-                <w:rFonts w:ascii="Calibri" w:cs="Calibri" w:eastAsia="Calibri" w:hAnsi="Calibri"/>
                 <w:b w:val="false"/>
                 <w:bCs w:val="false"/>
                 <w:i w:val="false"/>
@@ -677,6 +672,7 @@
                 <w:color w:val="222222"/>
                 <w:sz w:val="21"/>
                 <w:szCs w:val="21"/>
+                <w:rFonts w:ascii="Calibri" w:cs="Calibri" w:eastAsia="Calibri" w:hAnsi="Calibri"/>
               </w:rPr>
               <w:t xml:space="preserve">Solo i vincitori passano al backtest a TICK REALI (spread e fill veri). Qui cadono i falsi positivi.</w:t>
             </w:r>
@@ -697,22 +693,20 @@
             <w:vAlign w:val="center"/>
           </w:tcPr>
           <w:p>
-            <w:p>
-              <w:pPr>
-                <w:jc w:val="center"/>
-              </w:pPr>
-              <w:r>
-                <w:rPr>
-                  <w:rFonts w:ascii="Georgia" w:cs="Georgia" w:eastAsia="Georgia" w:hAnsi="Georgia"/>
-                  <w:b/>
-                  <w:bCs/>
-                  <w:color w:val="FFFFFF"/>
-                  <w:sz w:val="30"/>
-                  <w:szCs w:val="30"/>
-                </w:rPr>
-                <w:t xml:space="preserve">3</w:t>
-              </w:r>
-            </w:p>
+            <w:pPr>
+              <w:jc w:val="center"/>
+            </w:pPr>
+            <w:r>
+              <w:rPr>
+                <w:b/>
+                <w:bCs/>
+                <w:color w:val="FFFFFF"/>
+                <w:sz w:val="30"/>
+                <w:szCs w:val="30"/>
+                <w:rFonts w:ascii="Georgia" w:cs="Georgia" w:eastAsia="Georgia" w:hAnsi="Georgia"/>
+              </w:rPr>
+              <w:t xml:space="preserve">3</w:t>
+            </w:r>
           </w:p>
         </w:tc>
         <w:tc>
@@ -730,7 +724,6 @@
           <w:p>
             <w:r>
               <w:rPr>
-                <w:rFonts w:ascii="Calibri" w:cs="Calibri" w:eastAsia="Calibri" w:hAnsi="Calibri"/>
                 <w:b/>
                 <w:bCs/>
                 <w:i w:val="false"/>
@@ -738,6 +731,7 @@
                 <w:color w:val="2E5A8C"/>
                 <w:sz w:val="22"/>
                 <w:szCs w:val="22"/>
+                <w:rFonts w:ascii="Calibri" w:cs="Calibri" w:eastAsia="Calibri" w:hAnsi="Calibri"/>
               </w:rPr>
               <w:t xml:space="preserve">FORWARD</w:t>
             </w:r>
@@ -758,7 +752,6 @@
           <w:p>
             <w:r>
               <w:rPr>
-                <w:rFonts w:ascii="Calibri" w:cs="Calibri" w:eastAsia="Calibri" w:hAnsi="Calibri"/>
                 <w:b w:val="false"/>
                 <w:bCs w:val="false"/>
                 <w:i w:val="false"/>
@@ -766,6 +759,7 @@
                 <w:color w:val="222222"/>
                 <w:sz w:val="21"/>
                 <w:szCs w:val="21"/>
+                <w:rFonts w:ascii="Calibri" w:cs="Calibri" w:eastAsia="Calibri" w:hAnsi="Calibri"/>
               </w:rPr>
               <w:t xml:space="preserve">I validati girano su demo reale: raccolgo la pagella vera (Profit Factor e Drawdown reali).</w:t>
             </w:r>
@@ -786,22 +780,20 @@
             <w:vAlign w:val="center"/>
           </w:tcPr>
           <w:p>
-            <w:p>
-              <w:pPr>
-                <w:jc w:val="center"/>
-              </w:pPr>
-              <w:r>
-                <w:rPr>
-                  <w:rFonts w:ascii="Georgia" w:cs="Georgia" w:eastAsia="Georgia" w:hAnsi="Georgia"/>
-                  <w:b/>
-                  <w:bCs/>
-                  <w:color w:val="FFFFFF"/>
-                  <w:sz w:val="30"/>
-                  <w:szCs w:val="30"/>
-                </w:rPr>
-                <w:t xml:space="preserve">4</w:t>
-              </w:r>
-            </w:p>
+            <w:pPr>
+              <w:jc w:val="center"/>
+            </w:pPr>
+            <w:r>
+              <w:rPr>
+                <w:b/>
+                <w:bCs/>
+                <w:color w:val="FFFFFF"/>
+                <w:sz w:val="30"/>
+                <w:szCs w:val="30"/>
+                <w:rFonts w:ascii="Georgia" w:cs="Georgia" w:eastAsia="Georgia" w:hAnsi="Georgia"/>
+              </w:rPr>
+              <w:t xml:space="preserve">4</w:t>
+            </w:r>
           </w:p>
         </w:tc>
         <w:tc>
@@ -819,7 +811,6 @@
           <w:p>
             <w:r>
               <w:rPr>
-                <w:rFonts w:ascii="Calibri" w:cs="Calibri" w:eastAsia="Calibri" w:hAnsi="Calibri"/>
                 <w:b/>
                 <w:bCs/>
                 <w:i w:val="false"/>
@@ -827,6 +818,7 @@
                 <w:color w:val="2E5A8C"/>
                 <w:sz w:val="22"/>
                 <w:szCs w:val="22"/>
+                <w:rFonts w:ascii="Calibri" w:cs="Calibri" w:eastAsia="Calibri" w:hAnsi="Calibri"/>
               </w:rPr>
               <w:t xml:space="preserve">PROP-HARDENING</w:t>
             </w:r>
@@ -847,7 +839,6 @@
           <w:p>
             <w:r>
               <w:rPr>
-                <w:rFonts w:ascii="Calibri" w:cs="Calibri" w:eastAsia="Calibri" w:hAnsi="Calibri"/>
                 <w:b w:val="false"/>
                 <w:bCs w:val="false"/>
                 <w:i w:val="false"/>
@@ -855,6 +846,7 @@
                 <w:color w:val="222222"/>
                 <w:sz w:val="21"/>
                 <w:szCs w:val="21"/>
+                <w:rFonts w:ascii="Calibri" w:cs="Calibri" w:eastAsia="Calibri" w:hAnsi="Calibri"/>
               </w:rPr>
               <w:t xml:space="preserve">Correggo rischio/rendimento, aggiungo il “guardiano” del rischio, e faccio un dry-run su demo 100k con le regole esatte della prop.</w:t>
             </w:r>
@@ -868,20 +860,19 @@
       </w:pPr>
       <w:r>
         <w:rPr>
-          <w:rFonts w:ascii="Calibri" w:cs="Calibri" w:eastAsia="Calibri" w:hAnsi="Calibri"/>
-          <w:b w:val="false"/>
-          <w:bCs w:val="false"/>
-          <w:i w:val="false"/>
-          <w:iCs w:val="false"/>
-          <w:color w:val="222222"/>
-          <w:sz w:val="22"/>
-          <w:szCs w:val="22"/>
+          <w:b w:val="false"/>
+          <w:bCs w:val="false"/>
+          <w:i w:val="false"/>
+          <w:iCs w:val="false"/>
+          <w:color w:val="222222"/>
+          <w:sz w:val="22"/>
+          <w:szCs w:val="22"/>
+          <w:rFonts w:ascii="Calibri" w:cs="Calibri" w:eastAsia="Calibri" w:hAnsi="Calibri"/>
         </w:rPr>
         <w:t xml:space="preserve">Guardo soprattutto il </w:t>
       </w:r>
       <w:r>
         <w:rPr>
-          <w:rFonts w:ascii="Calibri" w:cs="Calibri" w:eastAsia="Calibri" w:hAnsi="Calibri"/>
           <w:b/>
           <w:bCs/>
           <w:i w:val="false"/>
@@ -889,25 +880,25 @@
           <w:color w:val="1F3A5F"/>
           <w:sz w:val="22"/>
           <w:szCs w:val="22"/>
+          <w:rFonts w:ascii="Calibri" w:cs="Calibri" w:eastAsia="Calibri" w:hAnsi="Calibri"/>
         </w:rPr>
         <w:t xml:space="preserve">Profit Factor mediano</w:t>
       </w:r>
       <w:r>
         <w:rPr>
-          <w:rFonts w:ascii="Calibri" w:cs="Calibri" w:eastAsia="Calibri" w:hAnsi="Calibri"/>
-          <w:b w:val="false"/>
-          <w:bCs w:val="false"/>
-          <w:i w:val="false"/>
-          <w:iCs w:val="false"/>
-          <w:color w:val="222222"/>
-          <w:sz w:val="22"/>
-          <w:szCs w:val="22"/>
+          <w:b w:val="false"/>
+          <w:bCs w:val="false"/>
+          <w:i w:val="false"/>
+          <w:iCs w:val="false"/>
+          <w:color w:val="222222"/>
+          <w:sz w:val="22"/>
+          <w:szCs w:val="22"/>
+          <w:rFonts w:ascii="Calibri" w:cs="Calibri" w:eastAsia="Calibri" w:hAnsi="Calibri"/>
         </w:rPr>
         <w:t xml:space="preserve"> (robustezza su tanti parametri) e il </w:t>
       </w:r>
       <w:r>
         <w:rPr>
-          <w:rFonts w:ascii="Calibri" w:cs="Calibri" w:eastAsia="Calibri" w:hAnsi="Calibri"/>
           <w:b/>
           <w:bCs/>
           <w:i w:val="false"/>
@@ -915,19 +906,20 @@
           <w:color w:val="1F3A5F"/>
           <w:sz w:val="22"/>
           <w:szCs w:val="22"/>
+          <w:rFonts w:ascii="Calibri" w:cs="Calibri" w:eastAsia="Calibri" w:hAnsi="Calibri"/>
         </w:rPr>
         <w:t xml:space="preserve">Drawdown</w:t>
       </w:r>
       <w:r>
         <w:rPr>
-          <w:rFonts w:ascii="Calibri" w:cs="Calibri" w:eastAsia="Calibri" w:hAnsi="Calibri"/>
-          <w:b w:val="false"/>
-          <w:bCs w:val="false"/>
-          <w:i w:val="false"/>
-          <w:iCs w:val="false"/>
-          <w:color w:val="222222"/>
-          <w:sz w:val="22"/>
-          <w:szCs w:val="22"/>
+          <w:b w:val="false"/>
+          <w:bCs w:val="false"/>
+          <w:i w:val="false"/>
+          <w:iCs w:val="false"/>
+          <w:color w:val="222222"/>
+          <w:sz w:val="22"/>
+          <w:szCs w:val="22"/>
+          <w:rFonts w:ascii="Calibri" w:cs="Calibri" w:eastAsia="Calibri" w:hAnsi="Calibri"/>
         </w:rPr>
         <w:t xml:space="preserve">, non il singolo risultato fortunato.</w:t>
       </w:r>
@@ -937,16 +929,16 @@
         <w:pBdr>
           <w:left w:val="single" w:color="2E5A8C" w:sz="24" w:space="12"/>
         </w:pBdr>
-        <w:spacing w:after="140" w:before="320"/>
-      </w:pPr>
-      <w:r>
-        <w:rPr>
-          <w:rFonts w:ascii="Georgia" w:cs="Georgia" w:eastAsia="Georgia" w:hAnsi="Georgia"/>
+        <w:spacing w:before="320" w:after="140"/>
+      </w:pPr>
+      <w:r>
+        <w:rPr>
           <w:b/>
           <w:bCs/>
           <w:color w:val="2E5A8C"/>
           <w:sz w:val="28"/>
           <w:szCs w:val="28"/>
+          <w:rFonts w:ascii="Georgia" w:cs="Georgia" w:eastAsia="Georgia" w:hAnsi="Georgia"/>
         </w:rPr>
         <w:t xml:space="preserve">I sistemi automatici che ho già costruito</w:t>
       </w:r>
@@ -962,7 +954,6 @@
       </w:pPr>
       <w:r>
         <w:rPr>
-          <w:rFonts w:ascii="Calibri" w:cs="Calibri" w:eastAsia="Calibri" w:hAnsi="Calibri"/>
           <w:b/>
           <w:bCs/>
           <w:i w:val="false"/>
@@ -970,19 +961,20 @@
           <w:color w:val="1F3A5F"/>
           <w:sz w:val="22"/>
           <w:szCs w:val="22"/>
+          <w:rFonts w:ascii="Calibri" w:cs="Calibri" w:eastAsia="Calibri" w:hAnsi="Calibri"/>
         </w:rPr>
         <w:t xml:space="preserve">Report di mercato giornaliero</w:t>
       </w:r>
       <w:r>
         <w:rPr>
-          <w:rFonts w:ascii="Calibri" w:cs="Calibri" w:eastAsia="Calibri" w:hAnsi="Calibri"/>
-          <w:b w:val="false"/>
-          <w:bCs w:val="false"/>
-          <w:i w:val="false"/>
-          <w:iCs w:val="false"/>
-          <w:color w:val="222222"/>
-          <w:sz w:val="22"/>
-          <w:szCs w:val="22"/>
+          <w:b w:val="false"/>
+          <w:bCs w:val="false"/>
+          <w:i w:val="false"/>
+          <w:iCs w:val="false"/>
+          <w:color w:val="222222"/>
+          <w:sz w:val="22"/>
+          <w:szCs w:val="22"/>
+          <w:rFonts w:ascii="Calibri" w:cs="Calibri" w:eastAsia="Calibri" w:hAnsi="Calibri"/>
         </w:rPr>
         <w:t xml:space="preserve"> (email ogni mattina): bias di trend, livelli, calendario banche centrali, posizionamento COT.</w:t>
       </w:r>
@@ -998,7 +990,6 @@
       </w:pPr>
       <w:r>
         <w:rPr>
-          <w:rFonts w:ascii="Calibri" w:cs="Calibri" w:eastAsia="Calibri" w:hAnsi="Calibri"/>
           <w:b/>
           <w:bCs/>
           <w:i w:val="false"/>
@@ -1006,19 +997,20 @@
           <w:color w:val="1F3A5F"/>
           <w:sz w:val="22"/>
           <w:szCs w:val="22"/>
+          <w:rFonts w:ascii="Calibri" w:cs="Calibri" w:eastAsia="Calibri" w:hAnsi="Calibri"/>
         </w:rPr>
         <w:t xml:space="preserve">Report settimanale</w:t>
       </w:r>
       <w:r>
         <w:rPr>
-          <w:rFonts w:ascii="Calibri" w:cs="Calibri" w:eastAsia="Calibri" w:hAnsi="Calibri"/>
-          <w:b w:val="false"/>
-          <w:bCs w:val="false"/>
-          <w:i w:val="false"/>
-          <w:iCs w:val="false"/>
-          <w:color w:val="222222"/>
-          <w:sz w:val="22"/>
-          <w:szCs w:val="22"/>
+          <w:b w:val="false"/>
+          <w:bCs w:val="false"/>
+          <w:i w:val="false"/>
+          <w:iCs w:val="false"/>
+          <w:color w:val="222222"/>
+          <w:sz w:val="22"/>
+          <w:szCs w:val="22"/>
+          <w:rFonts w:ascii="Calibri" w:cs="Calibri" w:eastAsia="Calibri" w:hAnsi="Calibri"/>
         </w:rPr>
         <w:t xml:space="preserve">: confronta il bias previsto con quello che il mercato ha fatto davvero.</w:t>
       </w:r>
@@ -1034,7 +1026,6 @@
       </w:pPr>
       <w:r>
         <w:rPr>
-          <w:rFonts w:ascii="Calibri" w:cs="Calibri" w:eastAsia="Calibri" w:hAnsi="Calibri"/>
           <w:b/>
           <w:bCs/>
           <w:i w:val="false"/>
@@ -1042,19 +1033,20 @@
           <w:color w:val="1F3A5F"/>
           <w:sz w:val="22"/>
           <w:szCs w:val="22"/>
+          <w:rFonts w:ascii="Calibri" w:cs="Calibri" w:eastAsia="Calibri" w:hAnsi="Calibri"/>
         </w:rPr>
         <w:t xml:space="preserve">Pipeline di backtest</w:t>
       </w:r>
       <w:r>
         <w:rPr>
-          <w:rFonts w:ascii="Calibri" w:cs="Calibri" w:eastAsia="Calibri" w:hAnsi="Calibri"/>
-          <w:b w:val="false"/>
-          <w:bCs w:val="false"/>
-          <w:i w:val="false"/>
-          <w:iCs w:val="false"/>
-          <w:color w:val="222222"/>
-          <w:sz w:val="22"/>
-          <w:szCs w:val="22"/>
+          <w:b w:val="false"/>
+          <w:bCs w:val="false"/>
+          <w:i w:val="false"/>
+          <w:iCs w:val="false"/>
+          <w:color w:val="222222"/>
+          <w:sz w:val="22"/>
+          <w:szCs w:val="22"/>
+          <w:rFonts w:ascii="Calibri" w:cs="Calibri" w:eastAsia="Calibri" w:hAnsi="Calibri"/>
         </w:rPr>
         <w:t xml:space="preserve">: scansiona i motori su tutti i simboli e timeframe, e valida i vincitori a tick reali.</w:t>
       </w:r>
@@ -1070,7 +1062,6 @@
       </w:pPr>
       <w:r>
         <w:rPr>
-          <w:rFonts w:ascii="Calibri" w:cs="Calibri" w:eastAsia="Calibri" w:hAnsi="Calibri"/>
           <w:b/>
           <w:bCs/>
           <w:i w:val="false"/>
@@ -1078,19 +1069,20 @@
           <w:color w:val="1F3A5F"/>
           <w:sz w:val="22"/>
           <w:szCs w:val="22"/>
+          <w:rFonts w:ascii="Calibri" w:cs="Calibri" w:eastAsia="Calibri" w:hAnsi="Calibri"/>
         </w:rPr>
         <w:t xml:space="preserve">Guardiano di portafoglio</w:t>
       </w:r>
       <w:r>
         <w:rPr>
-          <w:rFonts w:ascii="Calibri" w:cs="Calibri" w:eastAsia="Calibri" w:hAnsi="Calibri"/>
-          <w:b w:val="false"/>
-          <w:bCs w:val="false"/>
-          <w:i w:val="false"/>
-          <w:iCs w:val="false"/>
-          <w:color w:val="222222"/>
-          <w:sz w:val="22"/>
-          <w:szCs w:val="22"/>
+          <w:b w:val="false"/>
+          <w:bCs w:val="false"/>
+          <w:i w:val="false"/>
+          <w:iCs w:val="false"/>
+          <w:color w:val="222222"/>
+          <w:sz w:val="22"/>
+          <w:szCs w:val="22"/>
+          <w:rFonts w:ascii="Calibri" w:cs="Calibri" w:eastAsia="Calibri" w:hAnsi="Calibri"/>
         </w:rPr>
         <w:t xml:space="preserve">: un EA che fa rispettare i limiti prop (perdita giornaliera, drawdown totale) — chiude tutto e blocca se si sfora.</w:t>
       </w:r>
@@ -1100,16 +1092,16 @@
         <w:pBdr>
           <w:left w:val="single" w:color="2E5A8C" w:sz="24" w:space="12"/>
         </w:pBdr>
-        <w:spacing w:after="140" w:before="320"/>
-      </w:pPr>
-      <w:r>
-        <w:rPr>
-          <w:rFonts w:ascii="Georgia" w:cs="Georgia" w:eastAsia="Georgia" w:hAnsi="Georgia"/>
+        <w:spacing w:before="320" w:after="140"/>
+      </w:pPr>
+      <w:r>
+        <w:rPr>
           <w:b/>
           <w:bCs/>
           <w:color w:val="2E5A8C"/>
           <w:sz w:val="28"/>
           <w:szCs w:val="28"/>
+          <w:rFonts w:ascii="Georgia" w:cs="Georgia" w:eastAsia="Georgia" w:hAnsi="Georgia"/>
         </w:rPr>
         <w:t xml:space="preserve">Su cosa mi sto focalizzando adesso</w:t>
       </w:r>
@@ -1125,7 +1117,6 @@
       </w:pPr>
       <w:r>
         <w:rPr>
-          <w:rFonts w:ascii="Calibri" w:cs="Calibri" w:eastAsia="Calibri" w:hAnsi="Calibri"/>
           <w:b/>
           <w:bCs/>
           <w:i w:val="false"/>
@@ -1133,45 +1124,46 @@
           <w:color w:val="1F3A5F"/>
           <w:sz w:val="22"/>
           <w:szCs w:val="22"/>
+          <w:rFonts w:ascii="Calibri" w:cs="Calibri" w:eastAsia="Calibri" w:hAnsi="Calibri"/>
         </w:rPr>
         <w:t xml:space="preserve">Validare a tick reali TUTTE le strategie</w:t>
       </w:r>
       <w:r>
         <w:rPr>
-          <w:rFonts w:ascii="Calibri" w:cs="Calibri" w:eastAsia="Calibri" w:hAnsi="Calibri"/>
-          <w:b w:val="false"/>
-          <w:bCs w:val="false"/>
-          <w:i w:val="false"/>
-          <w:iCs w:val="false"/>
-          <w:color w:val="222222"/>
-          <w:sz w:val="22"/>
-          <w:szCs w:val="22"/>
+          <w:b w:val="false"/>
+          <w:bCs w:val="false"/>
+          <w:i w:val="false"/>
+          <w:iCs w:val="false"/>
+          <w:color w:val="222222"/>
+          <w:sz w:val="22"/>
+          <w:szCs w:val="22"/>
+          <w:rFonts w:ascii="Calibri" w:cs="Calibri" w:eastAsia="Calibri" w:hAnsi="Calibri"/>
         </w:rPr>
         <w:t xml:space="preserve"> su più timeframe, per costruire una </w:t>
       </w:r>
       <w:r>
         <w:rPr>
-          <w:rFonts w:ascii="Calibri" w:cs="Calibri" w:eastAsia="Calibri" w:hAnsi="Calibri"/>
-          <w:b/>
-          <w:bCs/>
-          <w:i w:val="false"/>
-          <w:iCs w:val="false"/>
-          <w:color w:val="222222"/>
-          <w:sz w:val="22"/>
-          <w:szCs w:val="22"/>
+          <w:b/>
+          <w:bCs/>
+          <w:i w:val="false"/>
+          <w:iCs w:val="false"/>
+          <w:color w:val="222222"/>
+          <w:sz w:val="22"/>
+          <w:szCs w:val="22"/>
+          <w:rFonts w:ascii="Calibri" w:cs="Calibri" w:eastAsia="Calibri" w:hAnsi="Calibri"/>
         </w:rPr>
         <w:t xml:space="preserve">matrice “motore × simbolo × timeframe”</w:t>
       </w:r>
       <w:r>
         <w:rPr>
-          <w:rFonts w:ascii="Calibri" w:cs="Calibri" w:eastAsia="Calibri" w:hAnsi="Calibri"/>
-          <w:b w:val="false"/>
-          <w:bCs w:val="false"/>
-          <w:i w:val="false"/>
-          <w:iCs w:val="false"/>
-          <w:color w:val="222222"/>
-          <w:sz w:val="22"/>
-          <w:szCs w:val="22"/>
+          <w:b w:val="false"/>
+          <w:bCs w:val="false"/>
+          <w:i w:val="false"/>
+          <w:iCs w:val="false"/>
+          <w:color w:val="222222"/>
+          <w:sz w:val="22"/>
+          <w:szCs w:val="22"/>
+          <w:rFonts w:ascii="Calibri" w:cs="Calibri" w:eastAsia="Calibri" w:hAnsi="Calibri"/>
         </w:rPr>
         <w:t xml:space="preserve"> e trovare le combinazioni vincenti.</w:t>
       </w:r>
@@ -1187,7 +1179,6 @@
       </w:pPr>
       <w:r>
         <w:rPr>
-          <w:rFonts w:ascii="Calibri" w:cs="Calibri" w:eastAsia="Calibri" w:hAnsi="Calibri"/>
           <w:b/>
           <w:bCs/>
           <w:i w:val="false"/>
@@ -1195,19 +1186,20 @@
           <w:color w:val="1F3A5F"/>
           <w:sz w:val="22"/>
           <w:szCs w:val="22"/>
+          <w:rFonts w:ascii="Calibri" w:cs="Calibri" w:eastAsia="Calibri" w:hAnsi="Calibri"/>
         </w:rPr>
         <w:t xml:space="preserve">Primi candidati in forward</w:t>
       </w:r>
       <w:r>
         <w:rPr>
-          <w:rFonts w:ascii="Calibri" w:cs="Calibri" w:eastAsia="Calibri" w:hAnsi="Calibri"/>
-          <w:b w:val="false"/>
-          <w:bCs w:val="false"/>
-          <w:i w:val="false"/>
-          <w:iCs w:val="false"/>
-          <w:color w:val="222222"/>
-          <w:sz w:val="22"/>
-          <w:szCs w:val="22"/>
+          <w:b w:val="false"/>
+          <w:bCs w:val="false"/>
+          <w:i w:val="false"/>
+          <w:iCs w:val="false"/>
+          <w:color w:val="222222"/>
+          <w:sz w:val="22"/>
+          <w:szCs w:val="22"/>
+          <w:rFonts w:ascii="Calibri" w:cs="Calibri" w:eastAsia="Calibri" w:hAnsi="Calibri"/>
         </w:rPr>
         <w:t xml:space="preserve"> su demo.</w:t>
       </w:r>
@@ -1223,7 +1215,6 @@
       </w:pPr>
       <w:r>
         <w:rPr>
-          <w:rFonts w:ascii="Calibri" w:cs="Calibri" w:eastAsia="Calibri" w:hAnsi="Calibri"/>
           <w:b/>
           <w:bCs/>
           <w:i w:val="false"/>
@@ -1231,25 +1222,25 @@
           <w:color w:val="1F3A5F"/>
           <w:sz w:val="22"/>
           <w:szCs w:val="22"/>
+          <w:rFonts w:ascii="Calibri" w:cs="Calibri" w:eastAsia="Calibri" w:hAnsi="Calibri"/>
         </w:rPr>
         <w:t xml:space="preserve">Un “motore di apertura” unico</w:t>
       </w:r>
       <w:r>
         <w:rPr>
-          <w:rFonts w:ascii="Calibri" w:cs="Calibri" w:eastAsia="Calibri" w:hAnsi="Calibri"/>
-          <w:b w:val="false"/>
-          <w:bCs w:val="false"/>
-          <w:i w:val="false"/>
-          <w:iCs w:val="false"/>
-          <w:color w:val="222222"/>
-          <w:sz w:val="22"/>
-          <w:szCs w:val="22"/>
+          <w:b w:val="false"/>
+          <w:bCs w:val="false"/>
+          <w:i w:val="false"/>
+          <w:iCs w:val="false"/>
+          <w:color w:val="222222"/>
+          <w:sz w:val="22"/>
+          <w:szCs w:val="22"/>
+          <w:rFonts w:ascii="Calibri" w:cs="Calibri" w:eastAsia="Calibri" w:hAnsi="Calibri"/>
         </w:rPr>
         <w:t xml:space="preserve"> su più indici: studio ampiezza del range e ritracciamenti per capire </w:t>
       </w:r>
       <w:r>
         <w:rPr>
-          <w:rFonts w:ascii="Calibri" w:cs="Calibri" w:eastAsia="Calibri" w:hAnsi="Calibri"/>
           <w:b/>
           <w:bCs/>
           <w:i w:val="false"/>
@@ -1257,19 +1248,20 @@
           <w:color w:val="B8860B"/>
           <w:sz w:val="22"/>
           <w:szCs w:val="22"/>
+          <w:rFonts w:ascii="Calibri" w:cs="Calibri" w:eastAsia="Calibri" w:hAnsi="Calibri"/>
         </w:rPr>
         <w:t xml:space="preserve">dove mettere stop / break-even / trailing / chiusura parziale</w:t>
       </w:r>
       <w:r>
         <w:rPr>
-          <w:rFonts w:ascii="Calibri" w:cs="Calibri" w:eastAsia="Calibri" w:hAnsi="Calibri"/>
-          <w:b w:val="false"/>
-          <w:bCs w:val="false"/>
-          <w:i w:val="false"/>
-          <w:iCs w:val="false"/>
-          <w:color w:val="222222"/>
-          <w:sz w:val="22"/>
-          <w:szCs w:val="22"/>
+          <w:b w:val="false"/>
+          <w:bCs w:val="false"/>
+          <w:i w:val="false"/>
+          <w:iCs w:val="false"/>
+          <w:color w:val="222222"/>
+          <w:sz w:val="22"/>
+          <w:szCs w:val="22"/>
+          <w:rFonts w:ascii="Calibri" w:cs="Calibri" w:eastAsia="Calibri" w:hAnsi="Calibri"/>
         </w:rPr>
         <w:t xml:space="preserve">.</w:t>
       </w:r>
@@ -1285,7 +1277,6 @@
       </w:pPr>
       <w:r>
         <w:rPr>
-          <w:rFonts w:ascii="Calibri" w:cs="Calibri" w:eastAsia="Calibri" w:hAnsi="Calibri"/>
           <w:b/>
           <w:bCs/>
           <w:i w:val="false"/>
@@ -1293,19 +1284,20 @@
           <w:color w:val="1F3A5F"/>
           <w:sz w:val="22"/>
           <w:szCs w:val="22"/>
+          <w:rFonts w:ascii="Calibri" w:cs="Calibri" w:eastAsia="Calibri" w:hAnsi="Calibri"/>
         </w:rPr>
         <w:t xml:space="preserve">Qualità del codice</w:t>
       </w:r>
       <w:r>
         <w:rPr>
-          <w:rFonts w:ascii="Calibri" w:cs="Calibri" w:eastAsia="Calibri" w:hAnsi="Calibri"/>
-          <w:b w:val="false"/>
-          <w:bCs w:val="false"/>
-          <w:i w:val="false"/>
-          <w:iCs w:val="false"/>
-          <w:color w:val="222222"/>
-          <w:sz w:val="22"/>
-          <w:szCs w:val="22"/>
+          <w:b w:val="false"/>
+          <w:bCs w:val="false"/>
+          <w:i w:val="false"/>
+          <w:iCs w:val="false"/>
+          <w:color w:val="222222"/>
+          <w:sz w:val="22"/>
+          <w:szCs w:val="22"/>
+          <w:rFonts w:ascii="Calibri" w:cs="Calibri" w:eastAsia="Calibri" w:hAnsi="Calibri"/>
         </w:rPr>
         <w:t xml:space="preserve">: ho appena trovato e corretto un bug importante nella gestione dei trade (conto Hedge, più EA sullo stesso strumento).</w:t>
       </w:r>
@@ -1315,16 +1307,16 @@
         <w:pBdr>
           <w:left w:val="single" w:color="2E5A8C" w:sz="24" w:space="12"/>
         </w:pBdr>
-        <w:spacing w:after="140" w:before="320"/>
-      </w:pPr>
-      <w:r>
-        <w:rPr>
-          <w:rFonts w:ascii="Georgia" w:cs="Georgia" w:eastAsia="Georgia" w:hAnsi="Georgia"/>
+        <w:spacing w:before="320" w:after="140"/>
+      </w:pPr>
+      <w:r>
+        <w:rPr>
           <w:b/>
           <w:bCs/>
           <w:color w:val="2E5A8C"/>
           <w:sz w:val="28"/>
           <w:szCs w:val="28"/>
+          <w:rFonts w:ascii="Georgia" w:cs="Georgia" w:eastAsia="Georgia" w:hAnsi="Georgia"/>
         </w:rPr>
         <w:t xml:space="preserve">Primi risultati concreti</w:t>
       </w:r>
@@ -1362,7 +1354,6 @@
             </w:pPr>
             <w:r>
               <w:rPr>
-                <w:rFonts w:ascii="Calibri" w:cs="Calibri" w:eastAsia="Calibri" w:hAnsi="Calibri"/>
                 <w:b/>
                 <w:bCs/>
                 <w:i w:val="false"/>
@@ -1370,6 +1361,7 @@
                 <w:color w:val="2E7D46"/>
                 <w:sz w:val="24"/>
                 <w:szCs w:val="24"/>
+                <w:rFonts w:ascii="Calibri" w:cs="Calibri" w:eastAsia="Calibri" w:hAnsi="Calibri"/>
               </w:rPr>
               <w:t xml:space="preserve">✅ SupertrendReversal sull’Oro (H4)</w:t>
             </w:r>
@@ -1377,7 +1369,6 @@
           <w:p>
             <w:r>
               <w:rPr>
-                <w:rFonts w:ascii="Calibri" w:cs="Calibri" w:eastAsia="Calibri" w:hAnsi="Calibri"/>
                 <w:b w:val="false"/>
                 <w:bCs w:val="false"/>
                 <w:i w:val="false"/>
@@ -1385,12 +1376,12 @@
                 <w:color w:val="222222"/>
                 <w:sz w:val="22"/>
                 <w:szCs w:val="22"/>
+                <w:rFonts w:ascii="Calibri" w:cs="Calibri" w:eastAsia="Calibri" w:hAnsi="Calibri"/>
               </w:rPr>
               <w:t xml:space="preserve">validato a tick reali: </w:t>
             </w:r>
             <w:r>
               <w:rPr>
-                <w:rFonts w:ascii="Calibri" w:cs="Calibri" w:eastAsia="Calibri" w:hAnsi="Calibri"/>
                 <w:b/>
                 <w:bCs/>
                 <w:i w:val="false"/>
@@ -1398,12 +1389,12 @@
                 <w:color w:val="1F3A5F"/>
                 <w:sz w:val="22"/>
                 <w:szCs w:val="22"/>
+                <w:rFonts w:ascii="Calibri" w:cs="Calibri" w:eastAsia="Calibri" w:hAnsi="Calibri"/>
               </w:rPr>
               <w:t xml:space="preserve">Profit Factor ~1,46</w:t>
             </w:r>
             <w:r>
               <w:rPr>
-                <w:rFonts w:ascii="Calibri" w:cs="Calibri" w:eastAsia="Calibri" w:hAnsi="Calibri"/>
                 <w:b w:val="false"/>
                 <w:bCs w:val="false"/>
                 <w:i w:val="false"/>
@@ -1411,12 +1402,12 @@
                 <w:color w:val="222222"/>
                 <w:sz w:val="22"/>
                 <w:szCs w:val="22"/>
+                <w:rFonts w:ascii="Calibri" w:cs="Calibri" w:eastAsia="Calibri" w:hAnsi="Calibri"/>
               </w:rPr>
               <w:t xml:space="preserve"> con </w:t>
             </w:r>
             <w:r>
               <w:rPr>
-                <w:rFonts w:ascii="Calibri" w:cs="Calibri" w:eastAsia="Calibri" w:hAnsi="Calibri"/>
                 <w:b/>
                 <w:bCs/>
                 <w:i w:val="false"/>
@@ -1424,12 +1415,12 @@
                 <w:color w:val="1F3A5F"/>
                 <w:sz w:val="22"/>
                 <w:szCs w:val="22"/>
+                <w:rFonts w:ascii="Calibri" w:cs="Calibri" w:eastAsia="Calibri" w:hAnsi="Calibri"/>
               </w:rPr>
               <w:t xml:space="preserve">Drawdown ~1,2%</w:t>
             </w:r>
             <w:r>
               <w:rPr>
-                <w:rFonts w:ascii="Calibri" w:cs="Calibri" w:eastAsia="Calibri" w:hAnsi="Calibri"/>
                 <w:b w:val="false"/>
                 <w:bCs w:val="false"/>
                 <w:i w:val="false"/>
@@ -1437,6 +1428,7 @@
                 <w:color w:val="222222"/>
                 <w:sz w:val="22"/>
                 <w:szCs w:val="22"/>
+                <w:rFonts w:ascii="Calibri" w:cs="Calibri" w:eastAsia="Calibri" w:hAnsi="Calibri"/>
               </w:rPr>
               <w:t xml:space="preserve"> → il mio candidato n°1 per la prop (drawdown bassissimo = tanto margine sotto i limiti).</w:t>
             </w:r>
@@ -1450,20 +1442,19 @@
       </w:pPr>
       <w:r>
         <w:rPr>
-          <w:rFonts w:ascii="Calibri" w:cs="Calibri" w:eastAsia="Calibri" w:hAnsi="Calibri"/>
-          <w:b w:val="false"/>
-          <w:bCs w:val="false"/>
-          <w:i w:val="false"/>
-          <w:iCs w:val="false"/>
-          <w:color w:val="222222"/>
-          <w:sz w:val="22"/>
-          <w:szCs w:val="22"/>
+          <w:b w:val="false"/>
+          <w:bCs w:val="false"/>
+          <w:i w:val="false"/>
+          <w:iCs w:val="false"/>
+          <w:color w:val="222222"/>
+          <w:sz w:val="22"/>
+          <w:szCs w:val="22"/>
+          <w:rFonts w:ascii="Calibri" w:cs="Calibri" w:eastAsia="Calibri" w:hAnsi="Calibri"/>
         </w:rPr>
         <w:t xml:space="preserve">Il metodo funziona anche a </w:t>
       </w:r>
       <w:r>
         <w:rPr>
-          <w:rFonts w:ascii="Calibri" w:cs="Calibri" w:eastAsia="Calibri" w:hAnsi="Calibri"/>
           <w:b/>
           <w:bCs/>
           <w:i w:val="false"/>
@@ -1471,25 +1462,25 @@
           <w:color w:val="B23A3A"/>
           <w:sz w:val="22"/>
           <w:szCs w:val="22"/>
+          <w:rFonts w:ascii="Calibri" w:cs="Calibri" w:eastAsia="Calibri" w:hAnsi="Calibri"/>
         </w:rPr>
         <w:t xml:space="preserve">scartare</w:t>
       </w:r>
       <w:r>
         <w:rPr>
-          <w:rFonts w:ascii="Calibri" w:cs="Calibri" w:eastAsia="Calibri" w:hAnsi="Calibri"/>
-          <w:b w:val="false"/>
-          <w:bCs w:val="false"/>
-          <w:i w:val="false"/>
-          <w:iCs w:val="false"/>
-          <w:color w:val="222222"/>
-          <w:sz w:val="22"/>
-          <w:szCs w:val="22"/>
+          <w:b w:val="false"/>
+          <w:bCs w:val="false"/>
+          <w:i w:val="false"/>
+          <w:iCs w:val="false"/>
+          <w:color w:val="222222"/>
+          <w:sz w:val="22"/>
+          <w:szCs w:val="22"/>
+          <w:rFonts w:ascii="Calibri" w:cs="Calibri" w:eastAsia="Calibri" w:hAnsi="Calibri"/>
         </w:rPr>
         <w:t xml:space="preserve">: Dow e ASX sembravano buoni in OHLC ma </w:t>
       </w:r>
       <w:r>
         <w:rPr>
-          <w:rFonts w:ascii="Calibri" w:cs="Calibri" w:eastAsia="Calibri" w:hAnsi="Calibri"/>
           <w:b/>
           <w:bCs/>
           <w:i w:val="false"/>
@@ -1497,19 +1488,20 @@
           <w:color w:val="B23A3A"/>
           <w:sz w:val="22"/>
           <w:szCs w:val="22"/>
+          <w:rFonts w:ascii="Calibri" w:cs="Calibri" w:eastAsia="Calibri" w:hAnsi="Calibri"/>
         </w:rPr>
         <w:t xml:space="preserve">sono crollati a tick reali</w:t>
       </w:r>
       <w:r>
         <w:rPr>
-          <w:rFonts w:ascii="Calibri" w:cs="Calibri" w:eastAsia="Calibri" w:hAnsi="Calibri"/>
-          <w:b w:val="false"/>
-          <w:bCs w:val="false"/>
-          <w:i w:val="false"/>
-          <w:iCs w:val="false"/>
-          <w:color w:val="222222"/>
-          <w:sz w:val="22"/>
-          <w:szCs w:val="22"/>
+          <w:b w:val="false"/>
+          <w:bCs w:val="false"/>
+          <w:i w:val="false"/>
+          <w:iCs w:val="false"/>
+          <w:color w:val="222222"/>
+          <w:sz w:val="22"/>
+          <w:szCs w:val="22"/>
+          <w:rFonts w:ascii="Calibri" w:cs="Calibri" w:eastAsia="Calibri" w:hAnsi="Calibri"/>
         </w:rPr>
         <w:t xml:space="preserve"> → esclusi. Meglio scoprirlo nel test che coi soldi.</w:t>
       </w:r>
@@ -1519,16 +1511,16 @@
         <w:pBdr>
           <w:left w:val="single" w:color="2E5A8C" w:sz="24" w:space="12"/>
         </w:pBdr>
-        <w:spacing w:after="140" w:before="320"/>
-      </w:pPr>
-      <w:r>
-        <w:rPr>
-          <w:rFonts w:ascii="Georgia" w:cs="Georgia" w:eastAsia="Georgia" w:hAnsi="Georgia"/>
+        <w:spacing w:before="320" w:after="140"/>
+      </w:pPr>
+      <w:r>
+        <w:rPr>
           <w:b/>
           <w:bCs/>
           <w:color w:val="2E5A8C"/>
           <w:sz w:val="28"/>
           <w:szCs w:val="28"/>
+          <w:rFonts w:ascii="Georgia" w:cs="Georgia" w:eastAsia="Georgia" w:hAnsi="Georgia"/>
         </w:rPr>
         <w:t xml:space="preserve">Il progetto prop (dove voglio arrivare)</w:t>
       </w:r>
@@ -1544,7 +1536,6 @@
       </w:pPr>
       <w:r>
         <w:rPr>
-          <w:rFonts w:ascii="Calibri" w:cs="Calibri" w:eastAsia="Calibri" w:hAnsi="Calibri"/>
           <w:b/>
           <w:bCs/>
           <w:i w:val="false"/>
@@ -1552,19 +1543,20 @@
           <w:color w:val="1F3A5F"/>
           <w:sz w:val="22"/>
           <w:szCs w:val="22"/>
+          <w:rFonts w:ascii="Calibri" w:cs="Calibri" w:eastAsia="Calibri" w:hAnsi="Calibri"/>
         </w:rPr>
         <w:t xml:space="preserve">2–4 EA diversificati</w:t>
       </w:r>
       <w:r>
         <w:rPr>
-          <w:rFonts w:ascii="Calibri" w:cs="Calibri" w:eastAsia="Calibri" w:hAnsi="Calibri"/>
-          <w:b w:val="false"/>
-          <w:bCs w:val="false"/>
-          <w:i w:val="false"/>
-          <w:iCs w:val="false"/>
-          <w:color w:val="222222"/>
-          <w:sz w:val="22"/>
-          <w:szCs w:val="22"/>
+          <w:b w:val="false"/>
+          <w:bCs w:val="false"/>
+          <w:i w:val="false"/>
+          <w:iCs w:val="false"/>
+          <w:color w:val="222222"/>
+          <w:sz w:val="22"/>
+          <w:szCs w:val="22"/>
+          <w:rFonts w:ascii="Calibri" w:cs="Calibri" w:eastAsia="Calibri" w:hAnsi="Calibri"/>
         </w:rPr>
         <w:t xml:space="preserve"> (strumenti/strategie non correlati) che rispettano le regole di una prop.</w:t>
       </w:r>
@@ -1580,7 +1572,6 @@
       </w:pPr>
       <w:r>
         <w:rPr>
-          <w:rFonts w:ascii="Calibri" w:cs="Calibri" w:eastAsia="Calibri" w:hAnsi="Calibri"/>
           <w:b/>
           <w:bCs/>
           <w:i w:val="false"/>
@@ -1588,19 +1579,20 @@
           <w:color w:val="1F3A5F"/>
           <w:sz w:val="22"/>
           <w:szCs w:val="22"/>
+          <w:rFonts w:ascii="Calibri" w:cs="Calibri" w:eastAsia="Calibri" w:hAnsi="Calibri"/>
         </w:rPr>
         <w:t xml:space="preserve">Riferimento FTMO</w:t>
       </w:r>
       <w:r>
         <w:rPr>
-          <w:rFonts w:ascii="Calibri" w:cs="Calibri" w:eastAsia="Calibri" w:hAnsi="Calibri"/>
-          <w:b w:val="false"/>
-          <w:bCs w:val="false"/>
-          <w:i w:val="false"/>
-          <w:iCs w:val="false"/>
-          <w:color w:val="222222"/>
-          <w:sz w:val="22"/>
-          <w:szCs w:val="22"/>
+          <w:b w:val="false"/>
+          <w:bCs w:val="false"/>
+          <w:i w:val="false"/>
+          <w:iCs w:val="false"/>
+          <w:color w:val="222222"/>
+          <w:sz w:val="22"/>
+          <w:szCs w:val="22"/>
+          <w:rFonts w:ascii="Calibri" w:cs="Calibri" w:eastAsia="Calibri" w:hAnsi="Calibri"/>
         </w:rPr>
         <w:t xml:space="preserve"> (regole pulite, EA ammessi, drawdown statico, nessun limite di tempo).</w:t>
       </w:r>
@@ -1616,7 +1608,6 @@
       </w:pPr>
       <w:r>
         <w:rPr>
-          <w:rFonts w:ascii="Calibri" w:cs="Calibri" w:eastAsia="Calibri" w:hAnsi="Calibri"/>
           <w:b/>
           <w:bCs/>
           <w:i w:val="false"/>
@@ -1624,19 +1615,20 @@
           <w:color w:val="1F3A5F"/>
           <w:sz w:val="22"/>
           <w:szCs w:val="22"/>
+          <w:rFonts w:ascii="Calibri" w:cs="Calibri" w:eastAsia="Calibri" w:hAnsi="Calibri"/>
         </w:rPr>
         <w:t xml:space="preserve">Dry-run su demo 100k</w:t>
       </w:r>
       <w:r>
         <w:rPr>
-          <w:rFonts w:ascii="Calibri" w:cs="Calibri" w:eastAsia="Calibri" w:hAnsi="Calibri"/>
-          <w:b w:val="false"/>
-          <w:bCs w:val="false"/>
-          <w:i w:val="false"/>
-          <w:iCs w:val="false"/>
-          <w:color w:val="222222"/>
-          <w:sz w:val="22"/>
-          <w:szCs w:val="22"/>
+          <w:b w:val="false"/>
+          <w:bCs w:val="false"/>
+          <w:i w:val="false"/>
+          <w:iCs w:val="false"/>
+          <w:color w:val="222222"/>
+          <w:sz w:val="22"/>
+          <w:szCs w:val="22"/>
+          <w:rFonts w:ascii="Calibri" w:cs="Calibri" w:eastAsia="Calibri" w:hAnsi="Calibri"/>
         </w:rPr>
         <w:t xml:space="preserve"> col guardiano, prima di pagare: “avrei passato la challenge?”.</w:t>
       </w:r>
@@ -1646,16 +1638,16 @@
         <w:pBdr>
           <w:left w:val="single" w:color="B8860B" w:sz="24" w:space="12"/>
         </w:pBdr>
-        <w:spacing w:after="140" w:before="320"/>
-      </w:pPr>
-      <w:r>
-        <w:rPr>
-          <w:rFonts w:ascii="Georgia" w:cs="Georgia" w:eastAsia="Georgia" w:hAnsi="Georgia"/>
+        <w:spacing w:before="320" w:after="140"/>
+      </w:pPr>
+      <w:r>
+        <w:rPr>
           <w:b/>
           <w:bCs/>
           <w:color w:val="B8860B"/>
           <w:sz w:val="28"/>
           <w:szCs w:val="28"/>
+          <w:rFonts w:ascii="Georgia" w:cs="Georgia" w:eastAsia="Georgia" w:hAnsi="Georgia"/>
         </w:rPr>
         <w:t xml:space="preserve">Dove mi piacerebbe il tuo aiuto, Emiliano</w:t>
       </w:r>
@@ -1671,20 +1663,19 @@
       </w:pPr>
       <w:r>
         <w:rPr>
-          <w:rFonts w:ascii="Calibri" w:cs="Calibri" w:eastAsia="Calibri" w:hAnsi="Calibri"/>
-          <w:b w:val="false"/>
-          <w:bCs w:val="false"/>
-          <w:i w:val="false"/>
-          <w:iCs w:val="false"/>
-          <w:color w:val="222222"/>
-          <w:sz w:val="22"/>
-          <w:szCs w:val="22"/>
+          <w:b w:val="false"/>
+          <w:bCs w:val="false"/>
+          <w:i w:val="false"/>
+          <w:iCs w:val="false"/>
+          <w:color w:val="222222"/>
+          <w:sz w:val="22"/>
+          <w:szCs w:val="22"/>
+          <w:rFonts w:ascii="Calibri" w:cs="Calibri" w:eastAsia="Calibri" w:hAnsi="Calibri"/>
         </w:rPr>
         <w:t xml:space="preserve">Un </w:t>
       </w:r>
       <w:r>
         <w:rPr>
-          <w:rFonts w:ascii="Calibri" w:cs="Calibri" w:eastAsia="Calibri" w:hAnsi="Calibri"/>
           <w:b/>
           <w:bCs/>
           <w:i w:val="false"/>
@@ -1692,19 +1683,20 @@
           <w:color w:val="1F3A5F"/>
           <w:sz w:val="22"/>
           <w:szCs w:val="22"/>
+          <w:rFonts w:ascii="Calibri" w:cs="Calibri" w:eastAsia="Calibri" w:hAnsi="Calibri"/>
         </w:rPr>
         <w:t xml:space="preserve">occhio critico</w:t>
       </w:r>
       <w:r>
         <w:rPr>
-          <w:rFonts w:ascii="Calibri" w:cs="Calibri" w:eastAsia="Calibri" w:hAnsi="Calibri"/>
-          <w:b w:val="false"/>
-          <w:bCs w:val="false"/>
-          <w:i w:val="false"/>
-          <w:iCs w:val="false"/>
-          <w:color w:val="222222"/>
-          <w:sz w:val="22"/>
-          <w:szCs w:val="22"/>
+          <w:b w:val="false"/>
+          <w:bCs w:val="false"/>
+          <w:i w:val="false"/>
+          <w:iCs w:val="false"/>
+          <w:color w:val="222222"/>
+          <w:sz w:val="22"/>
+          <w:szCs w:val="22"/>
+          <w:rFonts w:ascii="Calibri" w:cs="Calibri" w:eastAsia="Calibri" w:hAnsi="Calibri"/>
         </w:rPr>
         <w:t xml:space="preserve"> sul metodo e sulla scelta delle strategie.</w:t>
       </w:r>
@@ -1720,20 +1712,19 @@
       </w:pPr>
       <w:r>
         <w:rPr>
-          <w:rFonts w:ascii="Calibri" w:cs="Calibri" w:eastAsia="Calibri" w:hAnsi="Calibri"/>
-          <w:b w:val="false"/>
-          <w:bCs w:val="false"/>
-          <w:i w:val="false"/>
-          <w:iCs w:val="false"/>
-          <w:color w:val="222222"/>
-          <w:sz w:val="22"/>
-          <w:szCs w:val="22"/>
+          <w:b w:val="false"/>
+          <w:bCs w:val="false"/>
+          <w:i w:val="false"/>
+          <w:iCs w:val="false"/>
+          <w:color w:val="222222"/>
+          <w:sz w:val="22"/>
+          <w:szCs w:val="22"/>
+          <w:rFonts w:ascii="Calibri" w:cs="Calibri" w:eastAsia="Calibri" w:hAnsi="Calibri"/>
         </w:rPr>
         <w:t xml:space="preserve">Le tue </w:t>
       </w:r>
       <w:r>
         <w:rPr>
-          <w:rFonts w:ascii="Calibri" w:cs="Calibri" w:eastAsia="Calibri" w:hAnsi="Calibri"/>
           <w:b/>
           <w:bCs/>
           <w:i w:val="false"/>
@@ -1741,25 +1732,25 @@
           <w:color w:val="1F3A5F"/>
           <w:sz w:val="22"/>
           <w:szCs w:val="22"/>
+          <w:rFonts w:ascii="Calibri" w:cs="Calibri" w:eastAsia="Calibri" w:hAnsi="Calibri"/>
         </w:rPr>
         <w:t xml:space="preserve">strategie / live</w:t>
       </w:r>
       <w:r>
         <w:rPr>
-          <w:rFonts w:ascii="Calibri" w:cs="Calibri" w:eastAsia="Calibri" w:hAnsi="Calibri"/>
-          <w:b w:val="false"/>
-          <w:bCs w:val="false"/>
-          <w:i w:val="false"/>
-          <w:iCs w:val="false"/>
-          <w:color w:val="222222"/>
-          <w:sz w:val="22"/>
-          <w:szCs w:val="22"/>
+          <w:b w:val="false"/>
+          <w:bCs w:val="false"/>
+          <w:i w:val="false"/>
+          <w:iCs w:val="false"/>
+          <w:color w:val="222222"/>
+          <w:sz w:val="22"/>
+          <w:szCs w:val="22"/>
+          <w:rFonts w:ascii="Calibri" w:cs="Calibri" w:eastAsia="Calibri" w:hAnsi="Calibri"/>
         </w:rPr>
         <w:t xml:space="preserve">: quali sono </w:t>
       </w:r>
       <w:r>
         <w:rPr>
-          <w:rFonts w:ascii="Calibri" w:cs="Calibri" w:eastAsia="Calibri" w:hAnsi="Calibri"/>
           <w:b/>
           <w:bCs/>
           <w:i w:val="false"/>
@@ -1767,19 +1758,20 @@
           <w:color w:val="B8860B"/>
           <w:sz w:val="22"/>
           <w:szCs w:val="22"/>
+          <w:rFonts w:ascii="Calibri" w:cs="Calibri" w:eastAsia="Calibri" w:hAnsi="Calibri"/>
         </w:rPr>
         <w:t xml:space="preserve">meccanizzabili</w:t>
       </w:r>
       <w:r>
         <w:rPr>
-          <w:rFonts w:ascii="Calibri" w:cs="Calibri" w:eastAsia="Calibri" w:hAnsi="Calibri"/>
-          <w:b w:val="false"/>
-          <w:bCs w:val="false"/>
-          <w:i w:val="false"/>
-          <w:iCs w:val="false"/>
-          <w:color w:val="222222"/>
-          <w:sz w:val="22"/>
-          <w:szCs w:val="22"/>
+          <w:b w:val="false"/>
+          <w:bCs w:val="false"/>
+          <w:i w:val="false"/>
+          <w:iCs w:val="false"/>
+          <w:color w:val="222222"/>
+          <w:sz w:val="22"/>
+          <w:szCs w:val="22"/>
+          <w:rFonts w:ascii="Calibri" w:cs="Calibri" w:eastAsia="Calibri" w:hAnsi="Calibri"/>
         </w:rPr>
         <w:t xml:space="preserve"> in un EA (regole chiare di ingresso, stop, target) e quali restano discrezionali.</w:t>
       </w:r>
@@ -1795,20 +1787,19 @@
       </w:pPr>
       <w:r>
         <w:rPr>
-          <w:rFonts w:ascii="Calibri" w:cs="Calibri" w:eastAsia="Calibri" w:hAnsi="Calibri"/>
-          <w:b w:val="false"/>
-          <w:bCs w:val="false"/>
-          <w:i w:val="false"/>
-          <w:iCs w:val="false"/>
-          <w:color w:val="222222"/>
-          <w:sz w:val="22"/>
-          <w:szCs w:val="22"/>
+          <w:b w:val="false"/>
+          <w:bCs w:val="false"/>
+          <w:i w:val="false"/>
+          <w:iCs w:val="false"/>
+          <w:color w:val="222222"/>
+          <w:sz w:val="22"/>
+          <w:szCs w:val="22"/>
+          <w:rFonts w:ascii="Calibri" w:cs="Calibri" w:eastAsia="Calibri" w:hAnsi="Calibri"/>
         </w:rPr>
         <w:t xml:space="preserve">Consigli su </w:t>
       </w:r>
       <w:r>
         <w:rPr>
-          <w:rFonts w:ascii="Calibri" w:cs="Calibri" w:eastAsia="Calibri" w:hAnsi="Calibri"/>
           <w:b/>
           <w:bCs/>
           <w:i w:val="false"/>
@@ -1816,25 +1807,25 @@
           <w:color w:val="1F3A5F"/>
           <w:sz w:val="22"/>
           <w:szCs w:val="22"/>
+          <w:rFonts w:ascii="Calibri" w:cs="Calibri" w:eastAsia="Calibri" w:hAnsi="Calibri"/>
         </w:rPr>
         <w:t xml:space="preserve">gestione del rischio</w:t>
       </w:r>
       <w:r>
         <w:rPr>
-          <w:rFonts w:ascii="Calibri" w:cs="Calibri" w:eastAsia="Calibri" w:hAnsi="Calibri"/>
-          <w:b w:val="false"/>
-          <w:bCs w:val="false"/>
-          <w:i w:val="false"/>
-          <w:iCs w:val="false"/>
-          <w:color w:val="222222"/>
-          <w:sz w:val="22"/>
-          <w:szCs w:val="22"/>
+          <w:b w:val="false"/>
+          <w:bCs w:val="false"/>
+          <w:i w:val="false"/>
+          <w:iCs w:val="false"/>
+          <w:color w:val="222222"/>
+          <w:sz w:val="22"/>
+          <w:szCs w:val="22"/>
+          <w:rFonts w:ascii="Calibri" w:cs="Calibri" w:eastAsia="Calibri" w:hAnsi="Calibri"/>
         </w:rPr>
         <w:t xml:space="preserve"> e sulla </w:t>
       </w:r>
       <w:r>
         <w:rPr>
-          <w:rFonts w:ascii="Calibri" w:cs="Calibri" w:eastAsia="Calibri" w:hAnsi="Calibri"/>
           <w:b/>
           <w:bCs/>
           <w:i w:val="false"/>
@@ -1842,19 +1833,20 @@
           <w:color w:val="1F3A5F"/>
           <w:sz w:val="22"/>
           <w:szCs w:val="22"/>
+          <w:rFonts w:ascii="Calibri" w:cs="Calibri" w:eastAsia="Calibri" w:hAnsi="Calibri"/>
         </w:rPr>
         <w:t xml:space="preserve">scelta della prop</w:t>
       </w:r>
       <w:r>
         <w:rPr>
-          <w:rFonts w:ascii="Calibri" w:cs="Calibri" w:eastAsia="Calibri" w:hAnsi="Calibri"/>
-          <w:b w:val="false"/>
-          <w:bCs w:val="false"/>
-          <w:i w:val="false"/>
-          <w:iCs w:val="false"/>
-          <w:color w:val="222222"/>
-          <w:sz w:val="22"/>
-          <w:szCs w:val="22"/>
+          <w:b w:val="false"/>
+          <w:bCs w:val="false"/>
+          <w:i w:val="false"/>
+          <w:iCs w:val="false"/>
+          <w:color w:val="222222"/>
+          <w:sz w:val="22"/>
+          <w:szCs w:val="22"/>
+          <w:rFonts w:ascii="Calibri" w:cs="Calibri" w:eastAsia="Calibri" w:hAnsi="Calibri"/>
         </w:rPr>
         <w:t xml:space="preserve">.</w:t>
       </w:r>
@@ -1870,12 +1862,12 @@
       </w:pPr>
       <w:r>
         <w:rPr>
-          <w:rFonts w:ascii="Georgia" w:cs="Georgia" w:eastAsia="Georgia" w:hAnsi="Georgia"/>
           <w:b/>
           <w:bCs/>
           <w:color w:val="1F3A5F"/>
           <w:sz w:val="40"/>
           <w:szCs w:val="40"/>
+          <w:rFonts w:ascii="Georgia" w:cs="Georgia" w:eastAsia="Georgia" w:hAnsi="Georgia"/>
         </w:rPr>
         <w:t xml:space="preserve">Dove sono oggi — i numeri veri</w:t>
       </w:r>
@@ -1903,16 +1895,16 @@
         <w:pBdr>
           <w:left w:val="single" w:color="2E5A8C" w:sz="24" w:space="12"/>
         </w:pBdr>
-        <w:spacing w:after="140" w:before="320"/>
-      </w:pPr>
-      <w:r>
-        <w:rPr>
-          <w:rFonts w:ascii="Georgia" w:cs="Georgia" w:eastAsia="Georgia" w:hAnsi="Georgia"/>
+        <w:spacing w:before="320" w:after="140"/>
+      </w:pPr>
+      <w:r>
+        <w:rPr>
           <w:b/>
           <w:bCs/>
           <w:color w:val="2E5A8C"/>
           <w:sz w:val="28"/>
           <w:szCs w:val="28"/>
+          <w:rFonts w:ascii="Georgia" w:cs="Georgia" w:eastAsia="Georgia" w:hAnsi="Georgia"/>
         </w:rPr>
         <w:t xml:space="preserve">1 · Il motore giusto per ogni strategia (matrice motore × timeframe)</w:t>
       </w:r>
@@ -1923,20 +1915,19 @@
       </w:pPr>
       <w:r>
         <w:rPr>
-          <w:rFonts w:ascii="Calibri" w:cs="Calibri" w:eastAsia="Calibri" w:hAnsi="Calibri"/>
-          <w:b w:val="false"/>
-          <w:bCs w:val="false"/>
-          <w:i w:val="false"/>
-          <w:iCs w:val="false"/>
-          <w:color w:val="222222"/>
-          <w:sz w:val="22"/>
-          <w:szCs w:val="22"/>
+          <w:b w:val="false"/>
+          <w:bCs w:val="false"/>
+          <w:i w:val="false"/>
+          <w:iCs w:val="false"/>
+          <w:color w:val="222222"/>
+          <w:sz w:val="22"/>
+          <w:szCs w:val="22"/>
+          <w:rFonts w:ascii="Calibri" w:cs="Calibri" w:eastAsia="Calibri" w:hAnsi="Calibri"/>
         </w:rPr>
         <w:t xml:space="preserve">Ogni motore ha il </w:t>
       </w:r>
       <w:r>
         <w:rPr>
-          <w:rFonts w:ascii="Calibri" w:cs="Calibri" w:eastAsia="Calibri" w:hAnsi="Calibri"/>
           <w:b/>
           <w:bCs/>
           <w:i w:val="false"/>
@@ -1944,25 +1935,25 @@
           <w:color w:val="1F3A5F"/>
           <w:sz w:val="22"/>
           <w:szCs w:val="22"/>
+          <w:rFonts w:ascii="Calibri" w:cs="Calibri" w:eastAsia="Calibri" w:hAnsi="Calibri"/>
         </w:rPr>
         <w:t xml:space="preserve">suo</w:t>
       </w:r>
       <w:r>
         <w:rPr>
-          <w:rFonts w:ascii="Calibri" w:cs="Calibri" w:eastAsia="Calibri" w:hAnsi="Calibri"/>
-          <w:b w:val="false"/>
-          <w:bCs w:val="false"/>
-          <w:i w:val="false"/>
-          <w:iCs w:val="false"/>
-          <w:color w:val="222222"/>
-          <w:sz w:val="22"/>
-          <w:szCs w:val="22"/>
+          <w:b w:val="false"/>
+          <w:bCs w:val="false"/>
+          <w:i w:val="false"/>
+          <w:iCs w:val="false"/>
+          <w:color w:val="222222"/>
+          <w:sz w:val="22"/>
+          <w:szCs w:val="22"/>
+          <w:rFonts w:ascii="Calibri" w:cs="Calibri" w:eastAsia="Calibri" w:hAnsi="Calibri"/>
         </w:rPr>
         <w:t xml:space="preserve"> timeframe: cambiarlo trasforma uno scarto in un candidato. I numeri sono </w:t>
       </w:r>
       <w:r>
         <w:rPr>
-          <w:rFonts w:ascii="Calibri" w:cs="Calibri" w:eastAsia="Calibri" w:hAnsi="Calibri"/>
           <w:b/>
           <w:bCs/>
           <w:i w:val="false"/>
@@ -1970,19 +1961,20 @@
           <w:color w:val="B8860B"/>
           <w:sz w:val="22"/>
           <w:szCs w:val="22"/>
+          <w:rFonts w:ascii="Calibri" w:cs="Calibri" w:eastAsia="Calibri" w:hAnsi="Calibri"/>
         </w:rPr>
         <w:t xml:space="preserve">Profit Factor a TICK REALI</w:t>
       </w:r>
       <w:r>
         <w:rPr>
-          <w:rFonts w:ascii="Calibri" w:cs="Calibri" w:eastAsia="Calibri" w:hAnsi="Calibri"/>
-          <w:b w:val="false"/>
-          <w:bCs w:val="false"/>
-          <w:i w:val="false"/>
-          <w:iCs w:val="false"/>
-          <w:color w:val="222222"/>
-          <w:sz w:val="22"/>
-          <w:szCs w:val="22"/>
+          <w:b w:val="false"/>
+          <w:bCs w:val="false"/>
+          <w:i w:val="false"/>
+          <w:iCs w:val="false"/>
+          <w:color w:val="222222"/>
+          <w:sz w:val="22"/>
+          <w:szCs w:val="22"/>
+          <w:rFonts w:ascii="Calibri" w:cs="Calibri" w:eastAsia="Calibri" w:hAnsi="Calibri"/>
         </w:rPr>
         <w:t xml:space="preserve"> (dove disponibili).</w:t>
       </w:r>
@@ -2023,12 +2015,12 @@
           <w:p>
             <w:r>
               <w:rPr>
-                <w:rFonts w:ascii="Calibri" w:cs="Calibri" w:eastAsia="Calibri" w:hAnsi="Calibri"/>
                 <w:b/>
                 <w:bCs/>
                 <w:color w:val="FFFFFF"/>
                 <w:sz w:val="20"/>
                 <w:szCs w:val="20"/>
+                <w:rFonts w:ascii="Calibri" w:cs="Calibri" w:eastAsia="Calibri" w:hAnsi="Calibri"/>
               </w:rPr>
               <w:t xml:space="preserve">Motore</w:t>
             </w:r>
@@ -2048,12 +2040,12 @@
           <w:p>
             <w:r>
               <w:rPr>
-                <w:rFonts w:ascii="Calibri" w:cs="Calibri" w:eastAsia="Calibri" w:hAnsi="Calibri"/>
                 <w:b/>
                 <w:bCs/>
                 <w:color w:val="FFFFFF"/>
                 <w:sz w:val="20"/>
                 <w:szCs w:val="20"/>
+                <w:rFonts w:ascii="Calibri" w:cs="Calibri" w:eastAsia="Calibri" w:hAnsi="Calibri"/>
               </w:rPr>
               <w:t xml:space="preserve">TF migliore</w:t>
             </w:r>
@@ -2073,12 +2065,12 @@
           <w:p>
             <w:r>
               <w:rPr>
-                <w:rFonts w:ascii="Calibri" w:cs="Calibri" w:eastAsia="Calibri" w:hAnsi="Calibri"/>
                 <w:b/>
                 <w:bCs/>
                 <w:color w:val="FFFFFF"/>
                 <w:sz w:val="20"/>
                 <w:szCs w:val="20"/>
+                <w:rFonts w:ascii="Calibri" w:cs="Calibri" w:eastAsia="Calibri" w:hAnsi="Calibri"/>
               </w:rPr>
               <w:t xml:space="preserve">Migliori simboli (PF tick reali)</w:t>
             </w:r>
@@ -2098,12 +2090,12 @@
           <w:p>
             <w:r>
               <w:rPr>
-                <w:rFonts w:ascii="Calibri" w:cs="Calibri" w:eastAsia="Calibri" w:hAnsi="Calibri"/>
                 <w:b/>
                 <w:bCs/>
                 <w:color w:val="FFFFFF"/>
                 <w:sz w:val="20"/>
                 <w:szCs w:val="20"/>
+                <w:rFonts w:ascii="Calibri" w:cs="Calibri" w:eastAsia="Calibri" w:hAnsi="Calibri"/>
               </w:rPr>
               <w:t xml:space="preserve">Stato</w:t>
             </w:r>
@@ -2126,12 +2118,12 @@
           <w:p>
             <w:r>
               <w:rPr>
-                <w:rFonts w:ascii="Calibri" w:cs="Calibri" w:eastAsia="Calibri" w:hAnsi="Calibri"/>
                 <w:b/>
                 <w:bCs/>
                 <w:color w:val="2E5A8C"/>
                 <w:sz w:val="20"/>
                 <w:szCs w:val="20"/>
+                <w:rFonts w:ascii="Calibri" w:cs="Calibri" w:eastAsia="Calibri" w:hAnsi="Calibri"/>
               </w:rPr>
               <w:t xml:space="preserve">SupertrendReversal</w:t>
             </w:r>
@@ -2152,12 +2144,12 @@
           <w:p>
             <w:r>
               <w:rPr>
-                <w:rFonts w:ascii="Calibri" w:cs="Calibri" w:eastAsia="Calibri" w:hAnsi="Calibri"/>
                 <w:b w:val="false"/>
                 <w:bCs w:val="false"/>
                 <w:color w:val="222222"/>
                 <w:sz w:val="20"/>
                 <w:szCs w:val="20"/>
+                <w:rFonts w:ascii="Calibri" w:cs="Calibri" w:eastAsia="Calibri" w:hAnsi="Calibri"/>
               </w:rPr>
               <w:t xml:space="preserve">H4 (Nasdaq → H1)</w:t>
             </w:r>
@@ -2178,12 +2170,12 @@
           <w:p>
             <w:r>
               <w:rPr>
-                <w:rFonts w:ascii="Calibri" w:cs="Calibri" w:eastAsia="Calibri" w:hAnsi="Calibri"/>
                 <w:b w:val="false"/>
                 <w:bCs w:val="false"/>
                 <w:color w:val="222222"/>
                 <w:sz w:val="20"/>
                 <w:szCs w:val="20"/>
+                <w:rFonts w:ascii="Calibri" w:cs="Calibri" w:eastAsia="Calibri" w:hAnsi="Calibri"/>
               </w:rPr>
               <w:t xml:space="preserve">Oro 1,46 · Nasdaq H1 1,40 · Argento 1,37 (DD ~1–2%)</w:t>
             </w:r>
@@ -2204,12 +2196,12 @@
           <w:p>
             <w:r>
               <w:rPr>
-                <w:rFonts w:ascii="Calibri" w:cs="Calibri" w:eastAsia="Calibri" w:hAnsi="Calibri"/>
                 <w:b w:val="false"/>
                 <w:bCs w:val="false"/>
                 <w:color w:val="222222"/>
                 <w:sz w:val="20"/>
                 <w:szCs w:val="20"/>
+                <w:rFonts w:ascii="Calibri" w:cs="Calibri" w:eastAsia="Calibri" w:hAnsi="Calibri"/>
               </w:rPr>
               <w:t xml:space="preserve">5 in forward</w:t>
             </w:r>
@@ -2232,12 +2224,12 @@
           <w:p>
             <w:r>
               <w:rPr>
-                <w:rFonts w:ascii="Calibri" w:cs="Calibri" w:eastAsia="Calibri" w:hAnsi="Calibri"/>
                 <w:b/>
                 <w:bCs/>
                 <w:color w:val="2E5A8C"/>
                 <w:sz w:val="20"/>
                 <w:szCs w:val="20"/>
+                <w:rFonts w:ascii="Calibri" w:cs="Calibri" w:eastAsia="Calibri" w:hAnsi="Calibri"/>
               </w:rPr>
               <w:t xml:space="preserve">GoldenCross</w:t>
             </w:r>
@@ -2258,12 +2250,12 @@
           <w:p>
             <w:r>
               <w:rPr>
-                <w:rFonts w:ascii="Calibri" w:cs="Calibri" w:eastAsia="Calibri" w:hAnsi="Calibri"/>
                 <w:b w:val="false"/>
                 <w:bCs w:val="false"/>
                 <w:color w:val="222222"/>
                 <w:sz w:val="20"/>
                 <w:szCs w:val="20"/>
+                <w:rFonts w:ascii="Calibri" w:cs="Calibri" w:eastAsia="Calibri" w:hAnsi="Calibri"/>
               </w:rPr>
               <w:t xml:space="preserve">H1 (USDCHF → H4)</w:t>
             </w:r>
@@ -2284,12 +2276,12 @@
           <w:p>
             <w:r>
               <w:rPr>
-                <w:rFonts w:ascii="Calibri" w:cs="Calibri" w:eastAsia="Calibri" w:hAnsi="Calibri"/>
                 <w:b w:val="false"/>
                 <w:bCs w:val="false"/>
                 <w:color w:val="222222"/>
                 <w:sz w:val="20"/>
                 <w:szCs w:val="20"/>
+                <w:rFonts w:ascii="Calibri" w:cs="Calibri" w:eastAsia="Calibri" w:hAnsi="Calibri"/>
               </w:rPr>
               <w:t xml:space="preserve">USDCHF 2,63 · Argento 2,58 · EUR/AUD 3,34</w:t>
             </w:r>
@@ -2310,12 +2302,12 @@
           <w:p>
             <w:r>
               <w:rPr>
-                <w:rFonts w:ascii="Calibri" w:cs="Calibri" w:eastAsia="Calibri" w:hAnsi="Calibri"/>
                 <w:b w:val="false"/>
                 <w:bCs w:val="false"/>
                 <w:color w:val="222222"/>
                 <w:sz w:val="20"/>
                 <w:szCs w:val="20"/>
+                <w:rFonts w:ascii="Calibri" w:cs="Calibri" w:eastAsia="Calibri" w:hAnsi="Calibri"/>
               </w:rPr>
               <w:t xml:space="preserve">3 in forward</w:t>
             </w:r>
@@ -2338,12 +2330,12 @@
           <w:p>
             <w:r>
               <w:rPr>
-                <w:rFonts w:ascii="Calibri" w:cs="Calibri" w:eastAsia="Calibri" w:hAnsi="Calibri"/>
                 <w:b/>
                 <w:bCs/>
                 <w:color w:val="2E5A8C"/>
                 <w:sz w:val="20"/>
                 <w:szCs w:val="20"/>
+                <w:rFonts w:ascii="Calibri" w:cs="Calibri" w:eastAsia="Calibri" w:hAnsi="Calibri"/>
               </w:rPr>
               <w:t xml:space="preserve">EMA200</w:t>
             </w:r>
@@ -2364,12 +2356,12 @@
           <w:p>
             <w:r>
               <w:rPr>
-                <w:rFonts w:ascii="Calibri" w:cs="Calibri" w:eastAsia="Calibri" w:hAnsi="Calibri"/>
                 <w:b w:val="false"/>
                 <w:bCs w:val="false"/>
                 <w:color w:val="222222"/>
                 <w:sz w:val="20"/>
                 <w:szCs w:val="20"/>
+                <w:rFonts w:ascii="Calibri" w:cs="Calibri" w:eastAsia="Calibri" w:hAnsi="Calibri"/>
               </w:rPr>
               <w:t xml:space="preserve">H4</w:t>
             </w:r>
@@ -2390,12 +2382,12 @@
           <w:p>
             <w:r>
               <w:rPr>
-                <w:rFonts w:ascii="Calibri" w:cs="Calibri" w:eastAsia="Calibri" w:hAnsi="Calibri"/>
                 <w:b w:val="false"/>
                 <w:bCs w:val="false"/>
                 <w:color w:val="222222"/>
                 <w:sz w:val="20"/>
                 <w:szCs w:val="20"/>
+                <w:rFonts w:ascii="Calibri" w:cs="Calibri" w:eastAsia="Calibri" w:hAnsi="Calibri"/>
               </w:rPr>
               <w:t xml:space="preserve">200AUD 2,78 · AUD/JPY 2,68 · Oro 2,22 (OHLC)</w:t>
             </w:r>
@@ -2416,12 +2408,12 @@
           <w:p>
             <w:r>
               <w:rPr>
-                <w:rFonts w:ascii="Calibri" w:cs="Calibri" w:eastAsia="Calibri" w:hAnsi="Calibri"/>
                 <w:b w:val="false"/>
                 <w:bCs w:val="false"/>
                 <w:color w:val="222222"/>
                 <w:sz w:val="20"/>
                 <w:szCs w:val="20"/>
+                <w:rFonts w:ascii="Calibri" w:cs="Calibri" w:eastAsia="Calibri" w:hAnsi="Calibri"/>
               </w:rPr>
               <w:t xml:space="preserve">tick reali in corso</w:t>
             </w:r>
@@ -2435,20 +2427,19 @@
       </w:pPr>
       <w:r>
         <w:rPr>
-          <w:rFonts w:ascii="Calibri" w:cs="Calibri" w:eastAsia="Calibri" w:hAnsi="Calibri"/>
-          <w:b w:val="false"/>
-          <w:bCs w:val="false"/>
-          <w:i w:val="false"/>
-          <w:iCs w:val="false"/>
-          <w:color w:val="222222"/>
-          <w:sz w:val="22"/>
-          <w:szCs w:val="22"/>
+          <w:b w:val="false"/>
+          <w:bCs w:val="false"/>
+          <w:i w:val="false"/>
+          <w:iCs w:val="false"/>
+          <w:color w:val="222222"/>
+          <w:sz w:val="22"/>
+          <w:szCs w:val="22"/>
+          <w:rFonts w:ascii="Calibri" w:cs="Calibri" w:eastAsia="Calibri" w:hAnsi="Calibri"/>
         </w:rPr>
         <w:t xml:space="preserve">Esempio del perché il TF conta: il </w:t>
       </w:r>
       <w:r>
         <w:rPr>
-          <w:rFonts w:ascii="Calibri" w:cs="Calibri" w:eastAsia="Calibri" w:hAnsi="Calibri"/>
           <w:b/>
           <w:bCs/>
           <w:i w:val="false"/>
@@ -2456,25 +2447,25 @@
           <w:color w:val="1F3A5F"/>
           <w:sz w:val="22"/>
           <w:szCs w:val="22"/>
+          <w:rFonts w:ascii="Calibri" w:cs="Calibri" w:eastAsia="Calibri" w:hAnsi="Calibri"/>
         </w:rPr>
         <w:t xml:space="preserve">Nasdaq col SupertrendReversal</w:t>
       </w:r>
       <w:r>
         <w:rPr>
-          <w:rFonts w:ascii="Calibri" w:cs="Calibri" w:eastAsia="Calibri" w:hAnsi="Calibri"/>
-          <w:b w:val="false"/>
-          <w:bCs w:val="false"/>
-          <w:i w:val="false"/>
-          <w:iCs w:val="false"/>
-          <w:color w:val="222222"/>
-          <w:sz w:val="22"/>
-          <w:szCs w:val="22"/>
+          <w:b w:val="false"/>
+          <w:bCs w:val="false"/>
+          <w:i w:val="false"/>
+          <w:iCs w:val="false"/>
+          <w:color w:val="222222"/>
+          <w:sz w:val="22"/>
+          <w:szCs w:val="22"/>
+          <w:rFonts w:ascii="Calibri" w:cs="Calibri" w:eastAsia="Calibri" w:hAnsi="Calibri"/>
         </w:rPr>
         <w:t xml:space="preserve"> in H4 era spazzatura (0,68); in </w:t>
       </w:r>
       <w:r>
         <w:rPr>
-          <w:rFonts w:ascii="Calibri" w:cs="Calibri" w:eastAsia="Calibri" w:hAnsi="Calibri"/>
           <w:b/>
           <w:bCs/>
           <w:i w:val="false"/>
@@ -2482,19 +2473,20 @@
           <w:color w:val="2E7D46"/>
           <w:sz w:val="22"/>
           <w:szCs w:val="22"/>
+          <w:rFonts w:ascii="Calibri" w:cs="Calibri" w:eastAsia="Calibri" w:hAnsi="Calibri"/>
         </w:rPr>
         <w:t xml:space="preserve">H1 diventa 1,40 con drawdown 1,2%</w:t>
       </w:r>
       <w:r>
         <w:rPr>
-          <w:rFonts w:ascii="Calibri" w:cs="Calibri" w:eastAsia="Calibri" w:hAnsi="Calibri"/>
-          <w:b w:val="false"/>
-          <w:bCs w:val="false"/>
-          <w:i w:val="false"/>
-          <w:iCs w:val="false"/>
-          <w:color w:val="222222"/>
-          <w:sz w:val="22"/>
-          <w:szCs w:val="22"/>
+          <w:b w:val="false"/>
+          <w:bCs w:val="false"/>
+          <w:i w:val="false"/>
+          <w:iCs w:val="false"/>
+          <w:color w:val="222222"/>
+          <w:sz w:val="22"/>
+          <w:szCs w:val="22"/>
+          <w:rFonts w:ascii="Calibri" w:cs="Calibri" w:eastAsia="Calibri" w:hAnsi="Calibri"/>
         </w:rPr>
         <w:t xml:space="preserve">. Stesso motore, stesso simbolo — solo il timeframe giusto.</w:t>
       </w:r>
@@ -2504,16 +2496,16 @@
         <w:pBdr>
           <w:left w:val="single" w:color="2E5A8C" w:sz="24" w:space="12"/>
         </w:pBdr>
-        <w:spacing w:after="140" w:before="320"/>
-      </w:pPr>
-      <w:r>
-        <w:rPr>
-          <w:rFonts w:ascii="Georgia" w:cs="Georgia" w:eastAsia="Georgia" w:hAnsi="Georgia"/>
+        <w:spacing w:before="320" w:after="140"/>
+      </w:pPr>
+      <w:r>
+        <w:rPr>
           <w:b/>
           <w:bCs/>
           <w:color w:val="2E5A8C"/>
           <w:sz w:val="28"/>
           <w:szCs w:val="28"/>
+          <w:rFonts w:ascii="Georgia" w:cs="Georgia" w:eastAsia="Georgia" w:hAnsi="Georgia"/>
         </w:rPr>
         <w:t xml:space="preserve">2 · La squadra già in forward (8 EA validati)</w:t>
       </w:r>
@@ -2529,7 +2521,6 @@
       </w:pPr>
       <w:r>
         <w:rPr>
-          <w:rFonts w:ascii="Calibri" w:cs="Calibri" w:eastAsia="Calibri" w:hAnsi="Calibri"/>
           <w:b/>
           <w:bCs/>
           <w:i w:val="false"/>
@@ -2537,19 +2528,20 @@
           <w:color w:val="1F3A5F"/>
           <w:sz w:val="22"/>
           <w:szCs w:val="22"/>
+          <w:rFonts w:ascii="Calibri" w:cs="Calibri" w:eastAsia="Calibri" w:hAnsi="Calibri"/>
         </w:rPr>
         <w:t xml:space="preserve">5 SupertrendReversal</w:t>
       </w:r>
       <w:r>
         <w:rPr>
-          <w:rFonts w:ascii="Calibri" w:cs="Calibri" w:eastAsia="Calibri" w:hAnsi="Calibri"/>
-          <w:b w:val="false"/>
-          <w:bCs w:val="false"/>
-          <w:i w:val="false"/>
-          <w:iCs w:val="false"/>
-          <w:color w:val="222222"/>
-          <w:sz w:val="22"/>
-          <w:szCs w:val="22"/>
+          <w:b w:val="false"/>
+          <w:bCs w:val="false"/>
+          <w:i w:val="false"/>
+          <w:iCs w:val="false"/>
+          <w:color w:val="222222"/>
+          <w:sz w:val="22"/>
+          <w:szCs w:val="22"/>
+          <w:rFonts w:ascii="Calibri" w:cs="Calibri" w:eastAsia="Calibri" w:hAnsi="Calibri"/>
         </w:rPr>
         <w:t xml:space="preserve">: Oro, Argento, DAX, Nikkei (H4) + Nasdaq (H1).</w:t>
       </w:r>
@@ -2565,7 +2557,6 @@
       </w:pPr>
       <w:r>
         <w:rPr>
-          <w:rFonts w:ascii="Calibri" w:cs="Calibri" w:eastAsia="Calibri" w:hAnsi="Calibri"/>
           <w:b/>
           <w:bCs/>
           <w:i w:val="false"/>
@@ -2573,19 +2564,20 @@
           <w:color w:val="1F3A5F"/>
           <w:sz w:val="22"/>
           <w:szCs w:val="22"/>
+          <w:rFonts w:ascii="Calibri" w:cs="Calibri" w:eastAsia="Calibri" w:hAnsi="Calibri"/>
         </w:rPr>
         <w:t xml:space="preserve">3 GoldenCross</w:t>
       </w:r>
       <w:r>
         <w:rPr>
-          <w:rFonts w:ascii="Calibri" w:cs="Calibri" w:eastAsia="Calibri" w:hAnsi="Calibri"/>
-          <w:b w:val="false"/>
-          <w:bCs w:val="false"/>
-          <w:i w:val="false"/>
-          <w:iCs w:val="false"/>
-          <w:color w:val="222222"/>
-          <w:sz w:val="22"/>
-          <w:szCs w:val="22"/>
+          <w:b w:val="false"/>
+          <w:bCs w:val="false"/>
+          <w:i w:val="false"/>
+          <w:iCs w:val="false"/>
+          <w:color w:val="222222"/>
+          <w:sz w:val="22"/>
+          <w:szCs w:val="22"/>
+          <w:rFonts w:ascii="Calibri" w:cs="Calibri" w:eastAsia="Calibri" w:hAnsi="Calibri"/>
         </w:rPr>
         <w:t xml:space="preserve">: USDCHF, USDCAD, NZDUSD (H4) — strategia forex, diversifica dai metalli/indici.</w:t>
       </w:r>
@@ -2593,20 +2585,19 @@
     <w:p>
       <w:r>
         <w:rPr>
-          <w:rFonts w:ascii="Calibri" w:cs="Calibri" w:eastAsia="Calibri" w:hAnsi="Calibri"/>
-          <w:b w:val="false"/>
-          <w:bCs w:val="false"/>
-          <w:i w:val="false"/>
-          <w:iCs w:val="false"/>
-          <w:color w:val="222222"/>
-          <w:sz w:val="22"/>
-          <w:szCs w:val="22"/>
+          <w:b w:val="false"/>
+          <w:bCs w:val="false"/>
+          <w:i w:val="false"/>
+          <w:iCs w:val="false"/>
+          <w:color w:val="222222"/>
+          <w:sz w:val="22"/>
+          <w:szCs w:val="22"/>
+          <w:rFonts w:ascii="Calibri" w:cs="Calibri" w:eastAsia="Calibri" w:hAnsi="Calibri"/>
         </w:rPr>
         <w:t xml:space="preserve">Due strategie poco correlate, tutte a </w:t>
       </w:r>
       <w:r>
         <w:rPr>
-          <w:rFonts w:ascii="Calibri" w:cs="Calibri" w:eastAsia="Calibri" w:hAnsi="Calibri"/>
           <w:b/>
           <w:bCs/>
           <w:i w:val="false"/>
@@ -2614,19 +2605,20 @@
           <w:color w:val="2E7D46"/>
           <w:sz w:val="22"/>
           <w:szCs w:val="22"/>
+          <w:rFonts w:ascii="Calibri" w:cs="Calibri" w:eastAsia="Calibri" w:hAnsi="Calibri"/>
         </w:rPr>
         <w:t xml:space="preserve">drawdown basso</w:t>
       </w:r>
       <w:r>
         <w:rPr>
-          <w:rFonts w:ascii="Calibri" w:cs="Calibri" w:eastAsia="Calibri" w:hAnsi="Calibri"/>
-          <w:b w:val="false"/>
-          <w:bCs w:val="false"/>
-          <w:i w:val="false"/>
-          <w:iCs w:val="false"/>
-          <w:color w:val="222222"/>
-          <w:sz w:val="22"/>
-          <w:szCs w:val="22"/>
+          <w:b w:val="false"/>
+          <w:bCs w:val="false"/>
+          <w:i w:val="false"/>
+          <w:iCs w:val="false"/>
+          <w:color w:val="222222"/>
+          <w:sz w:val="22"/>
+          <w:szCs w:val="22"/>
+          <w:rFonts w:ascii="Calibri" w:cs="Calibri" w:eastAsia="Calibri" w:hAnsi="Calibri"/>
         </w:rPr>
         <w:t xml:space="preserve">. Ora raccolgo la pagella forward reale (~2-3 mesi).</w:t>
       </w:r>
@@ -2636,16 +2628,16 @@
         <w:pBdr>
           <w:left w:val="single" w:color="B8860B" w:sz="24" w:space="12"/>
         </w:pBdr>
-        <w:spacing w:after="140" w:before="320"/>
-      </w:pPr>
-      <w:r>
-        <w:rPr>
-          <w:rFonts w:ascii="Georgia" w:cs="Georgia" w:eastAsia="Georgia" w:hAnsi="Georgia"/>
+        <w:spacing w:before="320" w:after="140"/>
+      </w:pPr>
+      <w:r>
+        <w:rPr>
           <w:b/>
           <w:bCs/>
           <w:color w:val="B8860B"/>
           <w:sz w:val="28"/>
           <w:szCs w:val="28"/>
+          <w:rFonts w:ascii="Georgia" w:cs="Georgia" w:eastAsia="Georgia" w:hAnsi="Georgia"/>
         </w:rPr>
         <w:t xml:space="preserve">3 · Poi la gestione: BE / trailing / parziale (studio in corso)</w:t>
       </w:r>
@@ -2656,20 +2648,19 @@
       </w:pPr>
       <w:r>
         <w:rPr>
-          <w:rFonts w:ascii="Calibri" w:cs="Calibri" w:eastAsia="Calibri" w:hAnsi="Calibri"/>
-          <w:b w:val="false"/>
-          <w:bCs w:val="false"/>
-          <w:i w:val="false"/>
-          <w:iCs w:val="false"/>
-          <w:color w:val="222222"/>
-          <w:sz w:val="22"/>
-          <w:szCs w:val="22"/>
+          <w:b w:val="false"/>
+          <w:bCs w:val="false"/>
+          <w:i w:val="false"/>
+          <w:iCs w:val="false"/>
+          <w:color w:val="222222"/>
+          <w:sz w:val="22"/>
+          <w:szCs w:val="22"/>
+          <w:rFonts w:ascii="Calibri" w:cs="Calibri" w:eastAsia="Calibri" w:hAnsi="Calibri"/>
         </w:rPr>
         <w:t xml:space="preserve">Trovato il motore, </w:t>
       </w:r>
       <w:r>
         <w:rPr>
-          <w:rFonts w:ascii="Calibri" w:cs="Calibri" w:eastAsia="Calibri" w:hAnsi="Calibri"/>
           <w:b/>
           <w:bCs/>
           <w:i w:val="false"/>
@@ -2677,25 +2668,25 @@
           <w:color w:val="1F3A5F"/>
           <w:sz w:val="22"/>
           <w:szCs w:val="22"/>
+          <w:rFonts w:ascii="Calibri" w:cs="Calibri" w:eastAsia="Calibri" w:hAnsi="Calibri"/>
         </w:rPr>
         <w:t xml:space="preserve">costruisco sopra la gestione</w:t>
       </w:r>
       <w:r>
         <w:rPr>
-          <w:rFonts w:ascii="Calibri" w:cs="Calibri" w:eastAsia="Calibri" w:hAnsi="Calibri"/>
-          <w:b w:val="false"/>
-          <w:bCs w:val="false"/>
-          <w:i w:val="false"/>
-          <w:iCs w:val="false"/>
-          <w:color w:val="222222"/>
-          <w:sz w:val="22"/>
-          <w:szCs w:val="22"/>
+          <w:b w:val="false"/>
+          <w:bCs w:val="false"/>
+          <w:i w:val="false"/>
+          <w:iCs w:val="false"/>
+          <w:color w:val="222222"/>
+          <w:sz w:val="22"/>
+          <w:szCs w:val="22"/>
+          <w:rFonts w:ascii="Calibri" w:cs="Calibri" w:eastAsia="Calibri" w:hAnsi="Calibri"/>
         </w:rPr>
         <w:t xml:space="preserve"> e la testo a tick reali — proprio come dici tu: il trailing a tot punti serve a </w:t>
       </w:r>
       <w:r>
         <w:rPr>
-          <w:rFonts w:ascii="Calibri" w:cs="Calibri" w:eastAsia="Calibri" w:hAnsi="Calibri"/>
           <w:b/>
           <w:bCs/>
           <w:i w:val="false"/>
@@ -2703,19 +2694,20 @@
           <w:color w:val="B8860B"/>
           <w:sz w:val="22"/>
           <w:szCs w:val="22"/>
+          <w:rFonts w:ascii="Calibri" w:cs="Calibri" w:eastAsia="Calibri" w:hAnsi="Calibri"/>
         </w:rPr>
         <w:t xml:space="preserve">non restituire i profitti sui ritracciamenti</w:t>
       </w:r>
       <w:r>
         <w:rPr>
-          <w:rFonts w:ascii="Calibri" w:cs="Calibri" w:eastAsia="Calibri" w:hAnsi="Calibri"/>
-          <w:b w:val="false"/>
-          <w:bCs w:val="false"/>
-          <w:i w:val="false"/>
-          <w:iCs w:val="false"/>
-          <w:color w:val="222222"/>
-          <w:sz w:val="22"/>
-          <w:szCs w:val="22"/>
+          <w:b w:val="false"/>
+          <w:bCs w:val="false"/>
+          <w:i w:val="false"/>
+          <w:iCs w:val="false"/>
+          <w:color w:val="222222"/>
+          <w:sz w:val="22"/>
+          <w:szCs w:val="22"/>
+          <w:rFonts w:ascii="Calibri" w:cs="Calibri" w:eastAsia="Calibri" w:hAnsi="Calibri"/>
         </w:rPr>
         <w:t xml:space="preserve">. Sto misurando quale STRUTTURA rende di più sull’apertura di DAX e Nasdaq (M5):</w:t>
       </w:r>
@@ -2753,7 +2745,6 @@
             </w:pPr>
             <w:r>
               <w:rPr>
-                <w:rFonts w:ascii="Calibri" w:cs="Calibri" w:eastAsia="Calibri" w:hAnsi="Calibri"/>
                 <w:b/>
                 <w:bCs/>
                 <w:i w:val="false"/>
@@ -2761,6 +2752,7 @@
                 <w:color w:val="B8860B"/>
                 <w:sz w:val="23"/>
                 <w:szCs w:val="23"/>
+                <w:rFonts w:ascii="Calibri" w:cs="Calibri" w:eastAsia="Calibri" w:hAnsi="Calibri"/>
               </w:rPr>
               <w:t xml:space="preserve">Le strutture a confronto (16 combinazioni)</w:t>
             </w:r>
@@ -2768,7 +2760,6 @@
           <w:p>
             <w:r>
               <w:rPr>
-                <w:rFonts w:ascii="Calibri" w:cs="Calibri" w:eastAsia="Calibri" w:hAnsi="Calibri"/>
                 <w:b/>
                 <w:bCs/>
                 <w:i w:val="false"/>
@@ -2776,12 +2767,12 @@
                 <w:color w:val="222222"/>
                 <w:sz w:val="22"/>
                 <w:szCs w:val="22"/>
+                <w:rFonts w:ascii="Calibri" w:cs="Calibri" w:eastAsia="Calibri" w:hAnsi="Calibri"/>
               </w:rPr>
               <w:t xml:space="preserve">• Parziale/dimezza: </w:t>
             </w:r>
             <w:r>
               <w:rPr>
-                <w:rFonts w:ascii="Calibri" w:cs="Calibri" w:eastAsia="Calibri" w:hAnsi="Calibri"/>
                 <w:b w:val="false"/>
                 <w:bCs w:val="false"/>
                 <w:i w:val="false"/>
@@ -2789,6 +2780,7 @@
                 <w:color w:val="222222"/>
                 <w:sz w:val="22"/>
                 <w:szCs w:val="22"/>
+                <w:rFonts w:ascii="Calibri" w:cs="Calibri" w:eastAsia="Calibri" w:hAnsi="Calibri"/>
               </w:rPr>
               <w:t xml:space="preserve">OFF · 50% a 1R</w:t>
             </w:r>
@@ -2796,7 +2788,6 @@
           <w:p>
             <w:r>
               <w:rPr>
-                <w:rFonts w:ascii="Calibri" w:cs="Calibri" w:eastAsia="Calibri" w:hAnsi="Calibri"/>
                 <w:b/>
                 <w:bCs/>
                 <w:i w:val="false"/>
@@ -2804,12 +2795,12 @@
                 <w:color w:val="222222"/>
                 <w:sz w:val="22"/>
                 <w:szCs w:val="22"/>
+                <w:rFonts w:ascii="Calibri" w:cs="Calibri" w:eastAsia="Calibri" w:hAnsi="Calibri"/>
               </w:rPr>
               <w:t xml:space="preserve">• Break-even: </w:t>
             </w:r>
             <w:r>
               <w:rPr>
-                <w:rFonts w:ascii="Calibri" w:cs="Calibri" w:eastAsia="Calibri" w:hAnsi="Calibri"/>
                 <w:b w:val="false"/>
                 <w:bCs w:val="false"/>
                 <w:i w:val="false"/>
@@ -2817,6 +2808,7 @@
                 <w:color w:val="222222"/>
                 <w:sz w:val="22"/>
                 <w:szCs w:val="22"/>
+                <w:rFonts w:ascii="Calibri" w:cs="Calibri" w:eastAsia="Calibri" w:hAnsi="Calibri"/>
               </w:rPr>
               <w:t xml:space="preserve">OFF · dopo la parziale · indipendente a 1R</w:t>
             </w:r>
@@ -2824,7 +2816,6 @@
           <w:p>
             <w:r>
               <w:rPr>
-                <w:rFonts w:ascii="Calibri" w:cs="Calibri" w:eastAsia="Calibri" w:hAnsi="Calibri"/>
                 <w:b/>
                 <w:bCs/>
                 <w:i w:val="false"/>
@@ -2832,12 +2823,12 @@
                 <w:color w:val="222222"/>
                 <w:sz w:val="22"/>
                 <w:szCs w:val="22"/>
+                <w:rFonts w:ascii="Calibri" w:cs="Calibri" w:eastAsia="Calibri" w:hAnsi="Calibri"/>
               </w:rPr>
               <w:t xml:space="preserve">• Trailing: </w:t>
             </w:r>
             <w:r>
               <w:rPr>
-                <w:rFonts w:ascii="Calibri" w:cs="Calibri" w:eastAsia="Calibri" w:hAnsi="Calibri"/>
                 <w:b w:val="false"/>
                 <w:bCs w:val="false"/>
                 <w:i w:val="false"/>
@@ -2845,6 +2836,7 @@
                 <w:color w:val="222222"/>
                 <w:sz w:val="22"/>
                 <w:szCs w:val="22"/>
+                <w:rFonts w:ascii="Calibri" w:cs="Calibri" w:eastAsia="Calibri" w:hAnsi="Calibri"/>
               </w:rPr>
               <w:t xml:space="preserve">OFF · ATR · candela precedente · a punti fissi (anti-ritracciamento)</w:t>
             </w:r>
@@ -2858,20 +2850,19 @@
       </w:pPr>
       <w:r>
         <w:rPr>
-          <w:rFonts w:ascii="Calibri" w:cs="Calibri" w:eastAsia="Calibri" w:hAnsi="Calibri"/>
-          <w:b w:val="false"/>
-          <w:bCs w:val="false"/>
-          <w:i w:val="false"/>
-          <w:iCs w:val="false"/>
-          <w:color w:val="222222"/>
-          <w:sz w:val="22"/>
-          <w:szCs w:val="22"/>
+          <w:b w:val="false"/>
+          <w:bCs w:val="false"/>
+          <w:i w:val="false"/>
+          <w:iCs w:val="false"/>
+          <w:color w:val="222222"/>
+          <w:sz w:val="22"/>
+          <w:szCs w:val="22"/>
+          <w:rFonts w:ascii="Calibri" w:cs="Calibri" w:eastAsia="Calibri" w:hAnsi="Calibri"/>
         </w:rPr>
         <w:t xml:space="preserve">Il test dirà, </w:t>
       </w:r>
       <w:r>
         <w:rPr>
-          <w:rFonts w:ascii="Calibri" w:cs="Calibri" w:eastAsia="Calibri" w:hAnsi="Calibri"/>
           <w:b/>
           <w:bCs/>
           <w:i w:val="false"/>
@@ -2879,25 +2870,25 @@
           <w:color w:val="B8860B"/>
           <w:sz w:val="22"/>
           <w:szCs w:val="22"/>
+          <w:rFonts w:ascii="Calibri" w:cs="Calibri" w:eastAsia="Calibri" w:hAnsi="Calibri"/>
         </w:rPr>
         <w:t xml:space="preserve">sui numeri</w:t>
       </w:r>
       <w:r>
         <w:rPr>
-          <w:rFonts w:ascii="Calibri" w:cs="Calibri" w:eastAsia="Calibri" w:hAnsi="Calibri"/>
-          <w:b w:val="false"/>
-          <w:bCs w:val="false"/>
-          <w:i w:val="false"/>
-          <w:iCs w:val="false"/>
-          <w:color w:val="222222"/>
-          <w:sz w:val="22"/>
-          <w:szCs w:val="22"/>
+          <w:b w:val="false"/>
+          <w:bCs w:val="false"/>
+          <w:i w:val="false"/>
+          <w:iCs w:val="false"/>
+          <w:color w:val="222222"/>
+          <w:sz w:val="22"/>
+          <w:szCs w:val="22"/>
+          <w:rFonts w:ascii="Calibri" w:cs="Calibri" w:eastAsia="Calibri" w:hAnsi="Calibri"/>
         </w:rPr>
         <w:t xml:space="preserve">, se all’apertura conviene “solo trailing”, “dimezza + BE”, “BE + trailing”, ecc. — </w:t>
       </w:r>
       <w:r>
         <w:rPr>
-          <w:rFonts w:ascii="Calibri" w:cs="Calibri" w:eastAsia="Calibri" w:hAnsi="Calibri"/>
           <w:b/>
           <w:bCs/>
           <w:i w:val="false"/>
@@ -2905,19 +2896,20 @@
           <w:color w:val="1F3A5F"/>
           <w:sz w:val="22"/>
           <w:szCs w:val="22"/>
+          <w:rFonts w:ascii="Calibri" w:cs="Calibri" w:eastAsia="Calibri" w:hAnsi="Calibri"/>
         </w:rPr>
         <w:t xml:space="preserve">una risposta diversa per il DAX e per il Nasdaq</w:t>
       </w:r>
       <w:r>
         <w:rPr>
-          <w:rFonts w:ascii="Calibri" w:cs="Calibri" w:eastAsia="Calibri" w:hAnsi="Calibri"/>
-          <w:b w:val="false"/>
-          <w:bCs w:val="false"/>
-          <w:i w:val="false"/>
-          <w:iCs w:val="false"/>
-          <w:color w:val="222222"/>
-          <w:sz w:val="22"/>
-          <w:szCs w:val="22"/>
+          <w:b w:val="false"/>
+          <w:bCs w:val="false"/>
+          <w:i w:val="false"/>
+          <w:iCs w:val="false"/>
+          <w:color w:val="222222"/>
+          <w:sz w:val="22"/>
+          <w:szCs w:val="22"/>
+          <w:rFonts w:ascii="Calibri" w:cs="Calibri" w:eastAsia="Calibri" w:hAnsi="Calibri"/>
         </w:rPr>
         <w:t xml:space="preserve">, non a intuito.</w:t>
       </w:r>
@@ -2957,7 +2949,6 @@
           <w:p>
             <w:r>
               <w:rPr>
-                <w:rFonts w:ascii="Calibri" w:cs="Calibri" w:eastAsia="Calibri" w:hAnsi="Calibri"/>
                 <w:b/>
                 <w:bCs/>
                 <w:i/>
@@ -2965,12 +2956,12 @@
                 <w:color w:val="1F3A5F"/>
                 <w:sz w:val="22"/>
                 <w:szCs w:val="22"/>
+                <w:rFonts w:ascii="Calibri" w:cs="Calibri" w:eastAsia="Calibri" w:hAnsi="Calibri"/>
               </w:rPr>
               <w:t xml:space="preserve">In sintesi: </w:t>
             </w:r>
             <w:r>
               <w:rPr>
-                <w:rFonts w:ascii="Calibri" w:cs="Calibri" w:eastAsia="Calibri" w:hAnsi="Calibri"/>
                 <w:b w:val="false"/>
                 <w:bCs w:val="false"/>
                 <w:i/>
@@ -2978,6 +2969,7 @@
                 <w:color w:val="555555"/>
                 <w:sz w:val="22"/>
                 <w:szCs w:val="22"/>
+                <w:rFonts w:ascii="Calibri" w:cs="Calibri" w:eastAsia="Calibri" w:hAnsi="Calibri"/>
               </w:rPr>
               <w:t xml:space="preserve">sto trasformando il “poco tempo disponibile” in un vantaggio — un sistema che lavora per me, testato con metodo, con l’obiettivo prop come traguardo. Ogni passo è documentato e verificabile.</w:t>
             </w:r>
@@ -2985,6 +2977,20 @@
         </w:tc>
       </w:tr>
     </w:tbl>
+    <w:p>
+      <w:r>
+        <w:rPr>
+          <w:b w:val="false"/>
+          <w:bCs w:val="false"/>
+          <w:i w:val="false"/>
+          <w:iCs w:val="false"/>
+          <w:color w:val="222222"/>
+          <w:sz w:val="22"/>
+          <w:szCs w:val="22"/>
+          <w:rFonts w:ascii="Calibri" w:cs="Calibri" w:eastAsia="Calibri" w:hAnsi="Calibri"/>
+        </w:rPr>
+      </w:r>
+    </w:p>
     <w:sectPr>
       <w:pgSz w:w="11906" w:h="16838" w:orient="portrait"/>
       <w:pgMar w:top="1000" w:right="1080" w:bottom="1000" w:left="1080" w:header="708" w:footer="708" w:gutter="0"/>
@@ -2997,43 +3003,6 @@
 
 <file path=word/comments.xml><?xml version="1.0" encoding="utf-8"?>
 <w:comments xmlns:cx="http://schemas.microsoft.com/office/drawing/2014/chartex" xmlns:cx1="http://schemas.microsoft.com/office/drawing/2015/9/8/chartex" xmlns:cx2="http://schemas.microsoft.com/office/drawing/2015/10/21/chartex" xmlns:cx3="http://schemas.microsoft.com/office/drawing/2016/5/9/chartex" xmlns:cx4="http://schemas.microsoft.com/office/drawing/2016/5/10/chartex" xmlns:cx5="http://schemas.microsoft.com/office/drawing/2016/5/11/chartex" xmlns:cx6="http://schemas.microsoft.com/office/drawing/2016/5/12/chartex" xmlns:cx7="http://schemas.microsoft.com/office/drawing/2016/5/13/chartex" xmlns:cx8="http://schemas.microsoft.com/office/drawing/2016/5/14/chartex" xmlns:mc="http://schemas.openxmlformats.org/markup-compatibility/2006" xmlns:aink="http://schemas.microsoft.com/office/drawing/2016/ink" xmlns:am3d="http://schemas.microsoft.com/office/drawing/2017/model3d" xmlns:o="urn:schemas-microsoft-com:office:office" xmlns:r="http://schemas.openxmlformats.org/officeDocument/2006/relationships" xmlns:m="http://schemas.openxmlformats.org/officeDocument/2006/math" xmlns:v="urn:schemas-microsoft-com:vml" xmlns:wp14="http://schemas.microsoft.com/office/word/2010/wordprocessingDrawing" xmlns:wp="http://schemas.openxmlformats.org/drawingml/2006/wordprocessingDrawing" xmlns:w10="urn:schemas-microsoft-com:office:word" xmlns:w="http://schemas.openxmlformats.org/wordprocessingml/2006/main" xmlns:w14="http://schemas.microsoft.com/office/word/2010/wordml" xmlns:w15="http://schemas.microsoft.com/office/word/2012/wordml" xmlns:w16cex="http://schemas.microsoft.com/office/word/2018/wordml/cex" xmlns:w16cid="http://schemas.microsoft.com/office/word/2016/wordml/cid" xmlns:w16="http://schemas.microsoft.com/office/word/2018/wordml" xmlns:w16sdtdh="http://schemas.microsoft.com/office/word/2020/wordml/sdtdatahash" xmlns:w16se="http://schemas.microsoft.com/office/word/2015/wordml/symex" xmlns:wpg="http://schemas.microsoft.com/office/word/2010/wordprocessingGroup" xmlns:wpi="http://schemas.microsoft.com/office/word/2010/wordprocessingInk" xmlns:wne="http://schemas.microsoft.com/office/word/2006/wordml" xmlns:wps="http://schemas.microsoft.com/office/word/2010/wordprocessingShape"/>
-</file>
-
-<file path=word/endnotes.xml><?xml version="1.0" encoding="utf-8"?>
-<w:endnotes xmlns:wpc="http://schemas.microsoft.com/office/word/2010/wordprocessingCanvas" xmlns:mc="http://schemas.openxmlformats.org/markup-compatibility/2006" xmlns:o="urn:schemas-microsoft-com:office:office" xmlns:r="http://schemas.openxmlformats.org/officeDocument/2006/relationships" xmlns:m="http://schemas.openxmlformats.org/officeDocument/2006/math" xmlns:v="urn:schemas-microsoft-com:vml" xmlns:wp14="http://schemas.microsoft.com/office/word/2010/wordprocessingDrawing" xmlns:wp="http://schemas.openxmlformats.org/drawingml/2006/wordprocessingDrawing" xmlns:w10="urn:schemas-microsoft-com:office:word" xmlns:w="http://schemas.openxmlformats.org/wordprocessingml/2006/main" xmlns:w14="http://schemas.microsoft.com/office/word/2010/wordml" xmlns:w15="http://schemas.microsoft.com/office/word/2012/wordml" xmlns:wpg="http://schemas.microsoft.com/office/word/2010/wordprocessingGroup" xmlns:wpi="http://schemas.microsoft.com/office/word/2010/wordprocessingInk" xmlns:wne="http://schemas.microsoft.com/office/word/2006/wordml" xmlns:wps="http://schemas.microsoft.com/office/word/2010/wordprocessingShape" mc:Ignorable="w14 w15 wp14">
-  <w:endnote w:type="separator" w:id="-1">
-    <w:p>
-      <w:pPr>
-        <w:spacing w:after="0" w:line="240" w:lineRule="auto"/>
-      </w:pPr>
-      <w:r>
-        <w:rPr>
-          <w:rStyle w:val="EndnoteReference"/>
-        </w:rPr>
-        <w:endnoteRef/>
-      </w:r>
-      <w:r>
-        <w:separator/>
-      </w:r>
-    </w:p>
-  </w:endnote>
-  <w:endnote w:type="continuationSeparator" w:id="0">
-    <w:p>
-      <w:pPr>
-        <w:spacing w:after="0" w:line="240" w:lineRule="auto"/>
-      </w:pPr>
-      <w:r>
-        <w:rPr>
-          <w:rStyle w:val="EndnoteReference"/>
-        </w:rPr>
-        <w:endnoteRef/>
-      </w:r>
-      <w:r>
-        <w:continuationSeparator/>
-      </w:r>
-    </w:p>
-  </w:endnote>
-</w:endnotes>
 </file>
 
 <file path=word/footnotes.xml><?xml version="1.0" encoding="utf-8"?>
@@ -3217,10 +3186,10 @@
   <w:docDefaults>
     <w:rPrDefault>
       <w:rPr>
-        <w:rFonts w:ascii="Calibri" w:cs="Calibri" w:eastAsia="Calibri" w:hAnsi="Calibri"/>
         <w:color w:val="222222"/>
         <w:sz w:val="22"/>
         <w:szCs w:val="22"/>
+        <w:rFonts w:ascii="Calibri" w:cs="Calibri" w:eastAsia="Calibri" w:hAnsi="Calibri"/>
       </w:rPr>
     </w:rPrDefault>
     <w:pPrDefault/>
@@ -3318,8 +3287,8 @@
     <w:uiPriority w:val="99"/>
     <w:unhideWhenUsed/>
     <w:rPr>
+      <w:u w:val="single"/>
       <w:color w:val="0563C1"/>
-      <w:u w:val="single"/>
     </w:rPr>
   </w:style>
   <w:style w:type="character" w:styleId="FootnoteReference">
@@ -3359,42 +3328,5 @@
       <w:szCs w:val="20"/>
     </w:rPr>
   </w:style>
-  <w:style w:type="character" w:styleId="EndnoteReference">
-    <w:name w:val="endnote reference"/>
-    <w:basedOn w:val="DefaultParagraphFont"/>
-    <w:uiPriority w:val="99"/>
-    <w:semiHidden/>
-    <w:unhideWhenUsed/>
-    <w:rPr>
-      <w:vertAlign w:val="superscript"/>
-    </w:rPr>
-  </w:style>
-  <w:style w:type="paragraph" w:styleId="EndnoteText">
-    <w:name w:val="endnote text"/>
-    <w:basedOn w:val="Normal"/>
-    <w:link w:val="EndnoteTextChar"/>
-    <w:uiPriority w:val="99"/>
-    <w:semiHidden/>
-    <w:unhideWhenUsed/>
-    <w:pPr>
-      <w:spacing w:after="0" w:line="240" w:lineRule="auto"/>
-    </w:pPr>
-    <w:rPr>
-      <w:sz w:val="20"/>
-      <w:szCs w:val="20"/>
-    </w:rPr>
-  </w:style>
-  <w:style w:type="character" w:styleId="EndnoteTextChar">
-    <w:name w:val="Endnote Text Char"/>
-    <w:basedOn w:val="DefaultParagraphFont"/>
-    <w:link w:val="EndnoteText"/>
-    <w:uiPriority w:val="99"/>
-    <w:semiHidden/>
-    <w:unhideWhenUsed/>
-    <w:rPr>
-      <w:sz w:val="20"/>
-      <w:szCs w:val="20"/>
-    </w:rPr>
-  </w:style>
 </w:styles>
 </file>
</xml_diff>